<commit_message>
completado el kanban de smartsheet
</commit_message>
<xml_diff>
--- a/docs/Agent_Onboarding_ROI.docx
+++ b/docs/Agent_Onboarding_ROI.docx
@@ -4018,9 +4018,4121 @@
       </w:tr>
     </w:tbl>
     <w:p/>
+    <w:p>
+      <w:pPr>
+        <w:pStyle w:val="Heading1"/>
+      </w:pPr>
+      <w:r>
+        <w:rPr>
+          <w:rFonts w:ascii="Arial" w:hAnsi="Arial"/>
+          <w:color w:val="1F4E79"/>
+        </w:rPr>
+        <w:t>10. Grounded Implementation Work Plan</w:t>
+      </w:r>
+    </w:p>
+    <w:p>
+      <w:r>
+        <w:t>This implementation plan translates the updated Agent Onboarding &amp; Creation Workflow into a 60-hour MVP delivery backlog. The plan is sized for 4 hours per day, 5 days per week, across 3 weeks. It includes programming, template verification, Excel and Fieldglass ingestion, exports to downstream templates, CRUD workflows, approvals, audit/bitacora controls, integration testing, failure testing, and user acceptance testing.</w:t>
+      </w:r>
+    </w:p>
+    <w:p>
+      <w:r>
+        <w:t>Architecture alignment: the updated delivery model follows the workflow from demand planning and roster lock through SharePoint ingestion, validation, Fieldglass worker creation, master roster creation, NICE IEX configuration, agent creation, post-onboarding management, and monitoring/governance. Access remains the controlled master snapshot, and ordinary users do not write directly to the published database.</w:t>
+      </w:r>
+    </w:p>
+    <w:p>
+      <w:pPr>
+        <w:pStyle w:val="Heading2"/>
+      </w:pPr>
+      <w:r>
+        <w:rPr>
+          <w:rFonts w:ascii="Arial" w:hAnsi="Arial"/>
+        </w:rPr>
+        <w:t>10.1 Delivery Capacity</w:t>
+      </w:r>
+    </w:p>
+    <w:tbl>
+      <w:tblPr>
+        <w:tblStyle w:val="TableGrid"/>
+        <w:tblW w:type="auto" w:w="0"/>
+        <w:jc w:val="left"/>
+        <w:tblLook w:firstColumn="1" w:firstRow="1" w:lastColumn="0" w:lastRow="0" w:noHBand="0" w:noVBand="1" w:val="04A0"/>
+      </w:tblPr>
+      <w:tblGrid>
+        <w:gridCol w:w="7128"/>
+        <w:gridCol w:w="7128"/>
+      </w:tblGrid>
+      <w:tr>
+        <w:tc>
+          <w:tcPr>
+            <w:tcW w:type="dxa" w:w="7128"/>
+            <w:vAlign w:val="center"/>
+            <w:shd w:fill="1F4E79"/>
+          </w:tcPr>
+          <w:p>
+            <w:pPr>
+              <w:jc w:val="left"/>
+            </w:pPr>
+            <w:r/>
+            <w:r>
+              <w:rPr>
+                <w:rFonts w:ascii="Arial" w:hAnsi="Arial"/>
+                <w:b/>
+                <w:color w:val="FFFFFF"/>
+                <w:sz w:val="16"/>
+              </w:rPr>
+              <w:t>Duration</w:t>
+            </w:r>
+          </w:p>
+        </w:tc>
+        <w:tc>
+          <w:tcPr>
+            <w:tcW w:type="dxa" w:w="7128"/>
+            <w:vAlign w:val="center"/>
+          </w:tcPr>
+          <w:p>
+            <w:pPr>
+              <w:jc w:val="left"/>
+            </w:pPr>
+            <w:r/>
+            <w:r>
+              <w:rPr>
+                <w:rFonts w:ascii="Arial" w:hAnsi="Arial"/>
+                <w:b w:val="0"/>
+                <w:sz w:val="16"/>
+              </w:rPr>
+              <w:t>3 weeks</w:t>
+            </w:r>
+          </w:p>
+        </w:tc>
+      </w:tr>
+      <w:tr>
+        <w:tc>
+          <w:tcPr>
+            <w:tcW w:type="dxa" w:w="7128"/>
+            <w:vAlign w:val="center"/>
+            <w:shd w:fill="1F4E79"/>
+          </w:tcPr>
+          <w:p>
+            <w:pPr>
+              <w:jc w:val="left"/>
+            </w:pPr>
+            <w:r/>
+            <w:r>
+              <w:rPr>
+                <w:rFonts w:ascii="Arial" w:hAnsi="Arial"/>
+                <w:b/>
+                <w:color w:val="FFFFFF"/>
+                <w:sz w:val="16"/>
+              </w:rPr>
+              <w:t>Work rhythm</w:t>
+            </w:r>
+          </w:p>
+        </w:tc>
+        <w:tc>
+          <w:tcPr>
+            <w:tcW w:type="dxa" w:w="7128"/>
+            <w:vAlign w:val="center"/>
+          </w:tcPr>
+          <w:p>
+            <w:pPr>
+              <w:jc w:val="left"/>
+            </w:pPr>
+            <w:r/>
+            <w:r>
+              <w:rPr>
+                <w:rFonts w:ascii="Arial" w:hAnsi="Arial"/>
+                <w:b w:val="0"/>
+                <w:sz w:val="16"/>
+              </w:rPr>
+              <w:t>4 hours/day, 5 days/week</w:t>
+            </w:r>
+          </w:p>
+        </w:tc>
+      </w:tr>
+      <w:tr>
+        <w:tc>
+          <w:tcPr>
+            <w:tcW w:type="dxa" w:w="7128"/>
+            <w:vAlign w:val="center"/>
+            <w:shd w:fill="1F4E79"/>
+          </w:tcPr>
+          <w:p>
+            <w:pPr>
+              <w:jc w:val="left"/>
+            </w:pPr>
+            <w:r/>
+            <w:r>
+              <w:rPr>
+                <w:rFonts w:ascii="Arial" w:hAnsi="Arial"/>
+                <w:b/>
+                <w:color w:val="FFFFFF"/>
+                <w:sz w:val="16"/>
+              </w:rPr>
+              <w:t>Total capacity</w:t>
+            </w:r>
+          </w:p>
+        </w:tc>
+        <w:tc>
+          <w:tcPr>
+            <w:tcW w:type="dxa" w:w="7128"/>
+            <w:vAlign w:val="center"/>
+          </w:tcPr>
+          <w:p>
+            <w:pPr>
+              <w:jc w:val="left"/>
+            </w:pPr>
+            <w:r/>
+            <w:r>
+              <w:rPr>
+                <w:rFonts w:ascii="Arial" w:hAnsi="Arial"/>
+                <w:b w:val="0"/>
+                <w:sz w:val="16"/>
+              </w:rPr>
+              <w:t>60 hours</w:t>
+            </w:r>
+          </w:p>
+        </w:tc>
+      </w:tr>
+      <w:tr>
+        <w:tc>
+          <w:tcPr>
+            <w:tcW w:type="dxa" w:w="7128"/>
+            <w:vAlign w:val="center"/>
+            <w:shd w:fill="1F4E79"/>
+          </w:tcPr>
+          <w:p>
+            <w:pPr>
+              <w:jc w:val="left"/>
+            </w:pPr>
+            <w:r/>
+            <w:r>
+              <w:rPr>
+                <w:rFonts w:ascii="Arial" w:hAnsi="Arial"/>
+                <w:b/>
+                <w:color w:val="FFFFFF"/>
+                <w:sz w:val="16"/>
+              </w:rPr>
+              <w:t>Runtime constraint</w:t>
+            </w:r>
+          </w:p>
+        </w:tc>
+        <w:tc>
+          <w:tcPr>
+            <w:tcW w:type="dxa" w:w="7128"/>
+            <w:vAlign w:val="center"/>
+          </w:tcPr>
+          <w:p>
+            <w:pPr>
+              <w:jc w:val="left"/>
+            </w:pPr>
+            <w:r/>
+            <w:r>
+              <w:rPr>
+                <w:rFonts w:ascii="Arial" w:hAnsi="Arial"/>
+                <w:b w:val="0"/>
+                <w:sz w:val="16"/>
+              </w:rPr>
+              <w:t>Python 3.10 compatible implementation</w:t>
+            </w:r>
+          </w:p>
+        </w:tc>
+      </w:tr>
+      <w:tr>
+        <w:tc>
+          <w:tcPr>
+            <w:tcW w:type="dxa" w:w="7128"/>
+            <w:vAlign w:val="center"/>
+            <w:shd w:fill="1F4E79"/>
+          </w:tcPr>
+          <w:p>
+            <w:pPr>
+              <w:jc w:val="left"/>
+            </w:pPr>
+            <w:r/>
+            <w:r>
+              <w:rPr>
+                <w:rFonts w:ascii="Arial" w:hAnsi="Arial"/>
+                <w:b/>
+                <w:color w:val="FFFFFF"/>
+                <w:sz w:val="16"/>
+              </w:rPr>
+              <w:t>Delivery posture</w:t>
+            </w:r>
+          </w:p>
+        </w:tc>
+        <w:tc>
+          <w:tcPr>
+            <w:tcW w:type="dxa" w:w="7128"/>
+            <w:vAlign w:val="center"/>
+          </w:tcPr>
+          <w:p>
+            <w:pPr>
+              <w:jc w:val="left"/>
+            </w:pPr>
+            <w:r/>
+            <w:r>
+              <w:rPr>
+                <w:rFonts w:ascii="Arial" w:hAnsi="Arial"/>
+                <w:b w:val="0"/>
+                <w:sz w:val="16"/>
+              </w:rPr>
+              <w:t>MVP with integration tests, failure tests, UAT, and handoff documentation</w:t>
+            </w:r>
+          </w:p>
+        </w:tc>
+      </w:tr>
+    </w:tbl>
+    <w:p>
+      <w:pPr>
+        <w:pStyle w:val="Heading2"/>
+      </w:pPr>
+      <w:r>
+        <w:rPr>
+          <w:rFonts w:ascii="Arial" w:hAnsi="Arial"/>
+        </w:rPr>
+        <w:t>10.2 Smartsheet / Kanban Work Items</w:t>
+      </w:r>
+    </w:p>
+    <w:p>
+      <w:r>
+        <w:t>Use the following rows as Smartsheet Kanban cards. Recommended columns: Backlog, Ready, In Progress, Validation, Testing, UAT, Done, and Blocked.</w:t>
+      </w:r>
+    </w:p>
+    <w:p>
+      <w:pPr>
+        <w:pStyle w:val="Heading3"/>
+      </w:pPr>
+      <w:r>
+        <w:rPr>
+          <w:rFonts w:ascii="Arial" w:hAnsi="Arial"/>
+          <w:color w:val="1F4E79"/>
+        </w:rPr>
+        <w:t>Week 1 - Foundation</w:t>
+      </w:r>
+    </w:p>
+    <w:tbl>
+      <w:tblPr>
+        <w:tblStyle w:val="TableGrid"/>
+        <w:tblW w:type="auto" w:w="0"/>
+        <w:jc w:val="left"/>
+        <w:tblLook w:firstColumn="1" w:firstRow="1" w:lastColumn="0" w:lastRow="0" w:noHBand="0" w:noVBand="1" w:val="04A0"/>
+      </w:tblPr>
+      <w:tblGrid>
+        <w:gridCol w:w="2376"/>
+        <w:gridCol w:w="2376"/>
+        <w:gridCol w:w="2376"/>
+        <w:gridCol w:w="2376"/>
+        <w:gridCol w:w="2376"/>
+        <w:gridCol w:w="2376"/>
+      </w:tblGrid>
+      <w:tr>
+        <w:trPr>
+          <w:tblHeader w:val="true"/>
+        </w:trPr>
+        <w:tc>
+          <w:tcPr>
+            <w:tcW w:type="dxa" w:w="504"/>
+            <w:vAlign w:val="center"/>
+            <w:shd w:fill="1F4E79"/>
+          </w:tcPr>
+          <w:p>
+            <w:pPr>
+              <w:jc w:val="left"/>
+            </w:pPr>
+            <w:r/>
+            <w:r>
+              <w:rPr>
+                <w:rFonts w:ascii="Arial" w:hAnsi="Arial"/>
+                <w:b/>
+                <w:color w:val="FFFFFF"/>
+                <w:sz w:val="14"/>
+              </w:rPr>
+              <w:t>ID</w:t>
+            </w:r>
+          </w:p>
+        </w:tc>
+        <w:tc>
+          <w:tcPr>
+            <w:tcW w:type="dxa" w:w="1296"/>
+            <w:vAlign w:val="center"/>
+            <w:shd w:fill="1F4E79"/>
+          </w:tcPr>
+          <w:p>
+            <w:pPr>
+              <w:jc w:val="left"/>
+            </w:pPr>
+            <w:r/>
+            <w:r>
+              <w:rPr>
+                <w:rFonts w:ascii="Arial" w:hAnsi="Arial"/>
+                <w:b/>
+                <w:color w:val="FFFFFF"/>
+                <w:sz w:val="14"/>
+              </w:rPr>
+              <w:t>Phase</w:t>
+            </w:r>
+          </w:p>
+        </w:tc>
+        <w:tc>
+          <w:tcPr>
+            <w:tcW w:type="dxa" w:w="2088"/>
+            <w:vAlign w:val="center"/>
+            <w:shd w:fill="1F4E79"/>
+          </w:tcPr>
+          <w:p>
+            <w:pPr>
+              <w:jc w:val="left"/>
+            </w:pPr>
+            <w:r/>
+            <w:r>
+              <w:rPr>
+                <w:rFonts w:ascii="Arial" w:hAnsi="Arial"/>
+                <w:b/>
+                <w:color w:val="FFFFFF"/>
+                <w:sz w:val="14"/>
+              </w:rPr>
+              <w:t>Deliverable</w:t>
+            </w:r>
+          </w:p>
+        </w:tc>
+        <w:tc>
+          <w:tcPr>
+            <w:tcW w:type="dxa" w:w="4536"/>
+            <w:vAlign w:val="center"/>
+            <w:shd w:fill="1F4E79"/>
+          </w:tcPr>
+          <w:p>
+            <w:pPr>
+              <w:jc w:val="left"/>
+            </w:pPr>
+            <w:r/>
+            <w:r>
+              <w:rPr>
+                <w:rFonts w:ascii="Arial" w:hAnsi="Arial"/>
+                <w:b/>
+                <w:color w:val="FFFFFF"/>
+                <w:sz w:val="14"/>
+              </w:rPr>
+              <w:t>Work Item</w:t>
+            </w:r>
+          </w:p>
+        </w:tc>
+        <w:tc>
+          <w:tcPr>
+            <w:tcW w:type="dxa" w:w="648"/>
+            <w:vAlign w:val="center"/>
+            <w:shd w:fill="1F4E79"/>
+          </w:tcPr>
+          <w:p>
+            <w:pPr>
+              <w:jc w:val="left"/>
+            </w:pPr>
+            <w:r/>
+            <w:r>
+              <w:rPr>
+                <w:rFonts w:ascii="Arial" w:hAnsi="Arial"/>
+                <w:b/>
+                <w:color w:val="FFFFFF"/>
+                <w:sz w:val="14"/>
+              </w:rPr>
+              <w:t>Hours</w:t>
+            </w:r>
+          </w:p>
+        </w:tc>
+        <w:tc>
+          <w:tcPr>
+            <w:tcW w:type="dxa" w:w="4536"/>
+            <w:vAlign w:val="center"/>
+            <w:shd w:fill="1F4E79"/>
+          </w:tcPr>
+          <w:p>
+            <w:pPr>
+              <w:jc w:val="left"/>
+            </w:pPr>
+            <w:r/>
+            <w:r>
+              <w:rPr>
+                <w:rFonts w:ascii="Arial" w:hAnsi="Arial"/>
+                <w:b/>
+                <w:color w:val="FFFFFF"/>
+                <w:sz w:val="14"/>
+              </w:rPr>
+              <w:t>Done When</w:t>
+            </w:r>
+          </w:p>
+        </w:tc>
+      </w:tr>
+      <w:tr>
+        <w:tc>
+          <w:tcPr>
+            <w:tcW w:type="dxa" w:w="504"/>
+            <w:vAlign w:val="center"/>
+            <w:shd w:fill="EAF4F7"/>
+          </w:tcPr>
+          <w:p>
+            <w:pPr>
+              <w:jc w:val="left"/>
+            </w:pPr>
+            <w:r/>
+            <w:r>
+              <w:rPr>
+                <w:rFonts w:ascii="Arial" w:hAnsi="Arial"/>
+                <w:b w:val="0"/>
+                <w:sz w:val="14"/>
+              </w:rPr>
+              <w:t>1</w:t>
+            </w:r>
+          </w:p>
+        </w:tc>
+        <w:tc>
+          <w:tcPr>
+            <w:tcW w:type="dxa" w:w="1296"/>
+            <w:vAlign w:val="center"/>
+            <w:shd w:fill="EAF4F7"/>
+          </w:tcPr>
+          <w:p>
+            <w:pPr>
+              <w:jc w:val="left"/>
+            </w:pPr>
+            <w:r/>
+            <w:r>
+              <w:rPr>
+                <w:rFonts w:ascii="Arial" w:hAnsi="Arial"/>
+                <w:b w:val="0"/>
+                <w:sz w:val="14"/>
+              </w:rPr>
+              <w:t>Phase 0-2</w:t>
+            </w:r>
+          </w:p>
+        </w:tc>
+        <w:tc>
+          <w:tcPr>
+            <w:tcW w:type="dxa" w:w="2088"/>
+            <w:vAlign w:val="center"/>
+            <w:shd w:fill="EAF4F7"/>
+          </w:tcPr>
+          <w:p>
+            <w:pPr>
+              <w:jc w:val="left"/>
+            </w:pPr>
+            <w:r/>
+            <w:r>
+              <w:rPr>
+                <w:rFonts w:ascii="Arial" w:hAnsi="Arial"/>
+                <w:b w:val="0"/>
+                <w:sz w:val="14"/>
+              </w:rPr>
+              <w:t>Scope &amp; Architecture Baseline</w:t>
+            </w:r>
+          </w:p>
+        </w:tc>
+        <w:tc>
+          <w:tcPr>
+            <w:tcW w:type="dxa" w:w="4536"/>
+            <w:vAlign w:val="center"/>
+            <w:shd w:fill="EAF4F7"/>
+          </w:tcPr>
+          <w:p>
+            <w:pPr>
+              <w:jc w:val="left"/>
+            </w:pPr>
+            <w:r/>
+            <w:r>
+              <w:rPr>
+                <w:rFonts w:ascii="Arial" w:hAnsi="Arial"/>
+                <w:b w:val="0"/>
+                <w:sz w:val="12"/>
+              </w:rPr>
+              <w:t>Confirm updated end-to-end workflow, MVP boundaries, Python 3.10 constraint, SharePoint folder model, and single-writer/no-direct-client-write rule.</w:t>
+            </w:r>
+          </w:p>
+        </w:tc>
+        <w:tc>
+          <w:tcPr>
+            <w:tcW w:type="dxa" w:w="648"/>
+            <w:vAlign w:val="center"/>
+            <w:shd w:fill="EAF4F7"/>
+          </w:tcPr>
+          <w:p>
+            <w:pPr>
+              <w:jc w:val="left"/>
+            </w:pPr>
+            <w:r/>
+            <w:r>
+              <w:rPr>
+                <w:rFonts w:ascii="Arial" w:hAnsi="Arial"/>
+                <w:b w:val="0"/>
+                <w:sz w:val="14"/>
+              </w:rPr>
+              <w:t>2</w:t>
+            </w:r>
+          </w:p>
+        </w:tc>
+        <w:tc>
+          <w:tcPr>
+            <w:tcW w:type="dxa" w:w="4536"/>
+            <w:vAlign w:val="center"/>
+            <w:shd w:fill="EAF4F7"/>
+          </w:tcPr>
+          <w:p>
+            <w:pPr>
+              <w:jc w:val="left"/>
+            </w:pPr>
+            <w:r/>
+            <w:r>
+              <w:rPr>
+                <w:rFonts w:ascii="Arial" w:hAnsi="Arial"/>
+                <w:b w:val="0"/>
+                <w:sz w:val="12"/>
+              </w:rPr>
+              <w:t>Architecture notes match the new onboarding flow and identify source of truth, owners, and constraints.</w:t>
+            </w:r>
+          </w:p>
+        </w:tc>
+      </w:tr>
+      <w:tr>
+        <w:tc>
+          <w:tcPr>
+            <w:tcW w:type="dxa" w:w="504"/>
+            <w:vAlign w:val="center"/>
+            <w:shd w:fill="EAF4F7"/>
+          </w:tcPr>
+          <w:p>
+            <w:pPr>
+              <w:jc w:val="left"/>
+            </w:pPr>
+            <w:r/>
+            <w:r>
+              <w:rPr>
+                <w:rFonts w:ascii="Arial" w:hAnsi="Arial"/>
+                <w:b w:val="0"/>
+                <w:sz w:val="14"/>
+              </w:rPr>
+              <w:t>2</w:t>
+            </w:r>
+          </w:p>
+        </w:tc>
+        <w:tc>
+          <w:tcPr>
+            <w:tcW w:type="dxa" w:w="1296"/>
+            <w:vAlign w:val="center"/>
+            <w:shd w:fill="EAF4F7"/>
+          </w:tcPr>
+          <w:p>
+            <w:pPr>
+              <w:jc w:val="left"/>
+            </w:pPr>
+            <w:r/>
+            <w:r>
+              <w:rPr>
+                <w:rFonts w:ascii="Arial" w:hAnsi="Arial"/>
+                <w:b w:val="0"/>
+                <w:sz w:val="14"/>
+              </w:rPr>
+              <w:t>Phase 2</w:t>
+            </w:r>
+          </w:p>
+        </w:tc>
+        <w:tc>
+          <w:tcPr>
+            <w:tcW w:type="dxa" w:w="2088"/>
+            <w:vAlign w:val="center"/>
+            <w:shd w:fill="EAF4F7"/>
+          </w:tcPr>
+          <w:p>
+            <w:pPr>
+              <w:jc w:val="left"/>
+            </w:pPr>
+            <w:r/>
+            <w:r>
+              <w:rPr>
+                <w:rFonts w:ascii="Arial" w:hAnsi="Arial"/>
+                <w:b w:val="0"/>
+                <w:sz w:val="14"/>
+              </w:rPr>
+              <w:t>Configuration &amp; SharePoint Paths</w:t>
+            </w:r>
+          </w:p>
+        </w:tc>
+        <w:tc>
+          <w:tcPr>
+            <w:tcW w:type="dxa" w:w="4536"/>
+            <w:vAlign w:val="center"/>
+            <w:shd w:fill="EAF4F7"/>
+          </w:tcPr>
+          <w:p>
+            <w:pPr>
+              <w:jc w:val="left"/>
+            </w:pPr>
+            <w:r/>
+            <w:r>
+              <w:rPr>
+                <w:rFonts w:ascii="Arial" w:hAnsi="Arial"/>
+                <w:b w:val="0"/>
+                <w:sz w:val="12"/>
+              </w:rPr>
+              <w:t>Define runtime config for incoming roster, templates, pending requests, imported, quarantine, exports, archive, manifests, and Access snapshot folders.</w:t>
+            </w:r>
+          </w:p>
+        </w:tc>
+        <w:tc>
+          <w:tcPr>
+            <w:tcW w:type="dxa" w:w="648"/>
+            <w:vAlign w:val="center"/>
+            <w:shd w:fill="EAF4F7"/>
+          </w:tcPr>
+          <w:p>
+            <w:pPr>
+              <w:jc w:val="left"/>
+            </w:pPr>
+            <w:r/>
+            <w:r>
+              <w:rPr>
+                <w:rFonts w:ascii="Arial" w:hAnsi="Arial"/>
+                <w:b w:val="0"/>
+                <w:sz w:val="14"/>
+              </w:rPr>
+              <w:t>2</w:t>
+            </w:r>
+          </w:p>
+        </w:tc>
+        <w:tc>
+          <w:tcPr>
+            <w:tcW w:type="dxa" w:w="4536"/>
+            <w:vAlign w:val="center"/>
+            <w:shd w:fill="EAF4F7"/>
+          </w:tcPr>
+          <w:p>
+            <w:pPr>
+              <w:jc w:val="left"/>
+            </w:pPr>
+            <w:r/>
+            <w:r>
+              <w:rPr>
+                <w:rFonts w:ascii="Arial" w:hAnsi="Arial"/>
+                <w:b w:val="0"/>
+                <w:sz w:val="12"/>
+              </w:rPr>
+              <w:t>Config validates all required paths and reflects the SharePoint route used by the automation.</w:t>
+            </w:r>
+          </w:p>
+        </w:tc>
+      </w:tr>
+      <w:tr>
+        <w:tc>
+          <w:tcPr>
+            <w:tcW w:type="dxa" w:w="504"/>
+            <w:vAlign w:val="center"/>
+            <w:shd w:fill="EAF4F7"/>
+          </w:tcPr>
+          <w:p>
+            <w:pPr>
+              <w:jc w:val="left"/>
+            </w:pPr>
+            <w:r/>
+            <w:r>
+              <w:rPr>
+                <w:rFonts w:ascii="Arial" w:hAnsi="Arial"/>
+                <w:b w:val="0"/>
+                <w:sz w:val="14"/>
+              </w:rPr>
+              <w:t>3</w:t>
+            </w:r>
+          </w:p>
+        </w:tc>
+        <w:tc>
+          <w:tcPr>
+            <w:tcW w:type="dxa" w:w="1296"/>
+            <w:vAlign w:val="center"/>
+            <w:shd w:fill="EAF4F7"/>
+          </w:tcPr>
+          <w:p>
+            <w:pPr>
+              <w:jc w:val="left"/>
+            </w:pPr>
+            <w:r/>
+            <w:r>
+              <w:rPr>
+                <w:rFonts w:ascii="Arial" w:hAnsi="Arial"/>
+                <w:b w:val="0"/>
+                <w:sz w:val="14"/>
+              </w:rPr>
+              <w:t>Phase 1, 4, 6, 7</w:t>
+            </w:r>
+          </w:p>
+        </w:tc>
+        <w:tc>
+          <w:tcPr>
+            <w:tcW w:type="dxa" w:w="2088"/>
+            <w:vAlign w:val="center"/>
+            <w:shd w:fill="EAF4F7"/>
+          </w:tcPr>
+          <w:p>
+            <w:pPr>
+              <w:jc w:val="left"/>
+            </w:pPr>
+            <w:r/>
+            <w:r>
+              <w:rPr>
+                <w:rFonts w:ascii="Arial" w:hAnsi="Arial"/>
+                <w:b w:val="0"/>
+                <w:sz w:val="14"/>
+              </w:rPr>
+              <w:t>Template Inventory &amp; Verification</w:t>
+            </w:r>
+          </w:p>
+        </w:tc>
+        <w:tc>
+          <w:tcPr>
+            <w:tcW w:type="dxa" w:w="4536"/>
+            <w:vAlign w:val="center"/>
+            <w:shd w:fill="EAF4F7"/>
+          </w:tcPr>
+          <w:p>
+            <w:pPr>
+              <w:jc w:val="left"/>
+            </w:pPr>
+            <w:r/>
+            <w:r>
+              <w:rPr>
+                <w:rFonts w:ascii="Arial" w:hAnsi="Arial"/>
+                <w:b w:val="0"/>
+                <w:sz w:val="12"/>
+              </w:rPr>
+              <w:t>Review roster lock, Fieldglass, NICE IEX, and agent creation templates; record required sheets, headers, mandatory fields, owner, and validation rules.</w:t>
+            </w:r>
+          </w:p>
+        </w:tc>
+        <w:tc>
+          <w:tcPr>
+            <w:tcW w:type="dxa" w:w="648"/>
+            <w:vAlign w:val="center"/>
+            <w:shd w:fill="EAF4F7"/>
+          </w:tcPr>
+          <w:p>
+            <w:pPr>
+              <w:jc w:val="left"/>
+            </w:pPr>
+            <w:r/>
+            <w:r>
+              <w:rPr>
+                <w:rFonts w:ascii="Arial" w:hAnsi="Arial"/>
+                <w:b w:val="0"/>
+                <w:sz w:val="14"/>
+              </w:rPr>
+              <w:t>4</w:t>
+            </w:r>
+          </w:p>
+        </w:tc>
+        <w:tc>
+          <w:tcPr>
+            <w:tcW w:type="dxa" w:w="4536"/>
+            <w:vAlign w:val="center"/>
+            <w:shd w:fill="EAF4F7"/>
+          </w:tcPr>
+          <w:p>
+            <w:pPr>
+              <w:jc w:val="left"/>
+            </w:pPr>
+            <w:r/>
+            <w:r>
+              <w:rPr>
+                <w:rFonts w:ascii="Arial" w:hAnsi="Arial"/>
+                <w:b w:val="0"/>
+                <w:sz w:val="12"/>
+              </w:rPr>
+              <w:t>Template inventory and validation checklist are complete enough to drive ingestion/export coding.</w:t>
+            </w:r>
+          </w:p>
+        </w:tc>
+      </w:tr>
+      <w:tr>
+        <w:tc>
+          <w:tcPr>
+            <w:tcW w:type="dxa" w:w="504"/>
+            <w:vAlign w:val="center"/>
+            <w:shd w:fill="EAF4F7"/>
+          </w:tcPr>
+          <w:p>
+            <w:pPr>
+              <w:jc w:val="left"/>
+            </w:pPr>
+            <w:r/>
+            <w:r>
+              <w:rPr>
+                <w:rFonts w:ascii="Arial" w:hAnsi="Arial"/>
+                <w:b w:val="0"/>
+                <w:sz w:val="14"/>
+              </w:rPr>
+              <w:t>4</w:t>
+            </w:r>
+          </w:p>
+        </w:tc>
+        <w:tc>
+          <w:tcPr>
+            <w:tcW w:type="dxa" w:w="1296"/>
+            <w:vAlign w:val="center"/>
+            <w:shd w:fill="EAF4F7"/>
+          </w:tcPr>
+          <w:p>
+            <w:pPr>
+              <w:jc w:val="left"/>
+            </w:pPr>
+            <w:r/>
+            <w:r>
+              <w:rPr>
+                <w:rFonts w:ascii="Arial" w:hAnsi="Arial"/>
+                <w:b w:val="0"/>
+                <w:sz w:val="14"/>
+              </w:rPr>
+              <w:t>Phase 5, 9</w:t>
+            </w:r>
+          </w:p>
+        </w:tc>
+        <w:tc>
+          <w:tcPr>
+            <w:tcW w:type="dxa" w:w="2088"/>
+            <w:vAlign w:val="center"/>
+            <w:shd w:fill="EAF4F7"/>
+          </w:tcPr>
+          <w:p>
+            <w:pPr>
+              <w:jc w:val="left"/>
+            </w:pPr>
+            <w:r/>
+            <w:r>
+              <w:rPr>
+                <w:rFonts w:ascii="Arial" w:hAnsi="Arial"/>
+                <w:b w:val="0"/>
+                <w:sz w:val="14"/>
+              </w:rPr>
+              <w:t>Access &amp; Master Roster Data Model</w:t>
+            </w:r>
+          </w:p>
+        </w:tc>
+        <w:tc>
+          <w:tcPr>
+            <w:tcW w:type="dxa" w:w="4536"/>
+            <w:vAlign w:val="center"/>
+            <w:shd w:fill="EAF4F7"/>
+          </w:tcPr>
+          <w:p>
+            <w:pPr>
+              <w:jc w:val="left"/>
+            </w:pPr>
+            <w:r/>
+            <w:r>
+              <w:rPr>
+                <w:rFonts w:ascii="Arial" w:hAnsi="Arial"/>
+                <w:b w:val="0"/>
+                <w:sz w:val="12"/>
+              </w:rPr>
+              <w:t>Finalize Access schema for employees, workers, roles, approvals, requests, audit events, batches, versions, vendors, LOBs, skills, mappings, export runs, and agent lifecycle.</w:t>
+            </w:r>
+          </w:p>
+        </w:tc>
+        <w:tc>
+          <w:tcPr>
+            <w:tcW w:type="dxa" w:w="648"/>
+            <w:vAlign w:val="center"/>
+            <w:shd w:fill="EAF4F7"/>
+          </w:tcPr>
+          <w:p>
+            <w:pPr>
+              <w:jc w:val="left"/>
+            </w:pPr>
+            <w:r/>
+            <w:r>
+              <w:rPr>
+                <w:rFonts w:ascii="Arial" w:hAnsi="Arial"/>
+                <w:b w:val="0"/>
+                <w:sz w:val="14"/>
+              </w:rPr>
+              <w:t>3</w:t>
+            </w:r>
+          </w:p>
+        </w:tc>
+        <w:tc>
+          <w:tcPr>
+            <w:tcW w:type="dxa" w:w="4536"/>
+            <w:vAlign w:val="center"/>
+            <w:shd w:fill="EAF4F7"/>
+          </w:tcPr>
+          <w:p>
+            <w:pPr>
+              <w:jc w:val="left"/>
+            </w:pPr>
+            <w:r/>
+            <w:r>
+              <w:rPr>
+                <w:rFonts w:ascii="Arial" w:hAnsi="Arial"/>
+                <w:b w:val="0"/>
+                <w:sz w:val="12"/>
+              </w:rPr>
+              <w:t>Data model supports roster conversion, NUID tracking, post-onboarding updates, audit, and governance.</w:t>
+            </w:r>
+          </w:p>
+        </w:tc>
+      </w:tr>
+      <w:tr>
+        <w:tc>
+          <w:tcPr>
+            <w:tcW w:type="dxa" w:w="504"/>
+            <w:vAlign w:val="center"/>
+            <w:shd w:fill="EAF4F7"/>
+          </w:tcPr>
+          <w:p>
+            <w:pPr>
+              <w:jc w:val="left"/>
+            </w:pPr>
+            <w:r/>
+            <w:r>
+              <w:rPr>
+                <w:rFonts w:ascii="Arial" w:hAnsi="Arial"/>
+                <w:b w:val="0"/>
+                <w:sz w:val="14"/>
+              </w:rPr>
+              <w:t>5</w:t>
+            </w:r>
+          </w:p>
+        </w:tc>
+        <w:tc>
+          <w:tcPr>
+            <w:tcW w:type="dxa" w:w="1296"/>
+            <w:vAlign w:val="center"/>
+            <w:shd w:fill="EAF4F7"/>
+          </w:tcPr>
+          <w:p>
+            <w:pPr>
+              <w:jc w:val="left"/>
+            </w:pPr>
+            <w:r/>
+            <w:r>
+              <w:rPr>
+                <w:rFonts w:ascii="Arial" w:hAnsi="Arial"/>
+                <w:b w:val="0"/>
+                <w:sz w:val="14"/>
+              </w:rPr>
+              <w:t>Phase 1-3</w:t>
+            </w:r>
+          </w:p>
+        </w:tc>
+        <w:tc>
+          <w:tcPr>
+            <w:tcW w:type="dxa" w:w="2088"/>
+            <w:vAlign w:val="center"/>
+            <w:shd w:fill="EAF4F7"/>
+          </w:tcPr>
+          <w:p>
+            <w:pPr>
+              <w:jc w:val="left"/>
+            </w:pPr>
+            <w:r/>
+            <w:r>
+              <w:rPr>
+                <w:rFonts w:ascii="Arial" w:hAnsi="Arial"/>
+                <w:b w:val="0"/>
+                <w:sz w:val="14"/>
+              </w:rPr>
+              <w:t>Excel Ingestion Foundation</w:t>
+            </w:r>
+          </w:p>
+        </w:tc>
+        <w:tc>
+          <w:tcPr>
+            <w:tcW w:type="dxa" w:w="4536"/>
+            <w:vAlign w:val="center"/>
+            <w:shd w:fill="EAF4F7"/>
+          </w:tcPr>
+          <w:p>
+            <w:pPr>
+              <w:jc w:val="left"/>
+            </w:pPr>
+            <w:r/>
+            <w:r>
+              <w:rPr>
+                <w:rFonts w:ascii="Arial" w:hAnsi="Arial"/>
+                <w:b w:val="0"/>
+                <w:sz w:val="12"/>
+              </w:rPr>
+              <w:t>Build reusable Excel reader/validator for roster files and templates using OpenPyXL.</w:t>
+            </w:r>
+          </w:p>
+        </w:tc>
+        <w:tc>
+          <w:tcPr>
+            <w:tcW w:type="dxa" w:w="648"/>
+            <w:vAlign w:val="center"/>
+            <w:shd w:fill="EAF4F7"/>
+          </w:tcPr>
+          <w:p>
+            <w:pPr>
+              <w:jc w:val="left"/>
+            </w:pPr>
+            <w:r/>
+            <w:r>
+              <w:rPr>
+                <w:rFonts w:ascii="Arial" w:hAnsi="Arial"/>
+                <w:b w:val="0"/>
+                <w:sz w:val="14"/>
+              </w:rPr>
+              <w:t>4</w:t>
+            </w:r>
+          </w:p>
+        </w:tc>
+        <w:tc>
+          <w:tcPr>
+            <w:tcW w:type="dxa" w:w="4536"/>
+            <w:vAlign w:val="center"/>
+            <w:shd w:fill="EAF4F7"/>
+          </w:tcPr>
+          <w:p>
+            <w:pPr>
+              <w:jc w:val="left"/>
+            </w:pPr>
+            <w:r/>
+            <w:r>
+              <w:rPr>
+                <w:rFonts w:ascii="Arial" w:hAnsi="Arial"/>
+                <w:b w:val="0"/>
+                <w:sz w:val="12"/>
+              </w:rPr>
+              <w:t>Reads configured workbook, sheet, and header layouts; returns normalized rows plus row-level validation errors.</w:t>
+            </w:r>
+          </w:p>
+        </w:tc>
+      </w:tr>
+      <w:tr>
+        <w:tc>
+          <w:tcPr>
+            <w:tcW w:type="dxa" w:w="504"/>
+            <w:vAlign w:val="center"/>
+            <w:shd w:fill="EAF4F7"/>
+          </w:tcPr>
+          <w:p>
+            <w:pPr>
+              <w:jc w:val="left"/>
+            </w:pPr>
+            <w:r/>
+            <w:r>
+              <w:rPr>
+                <w:rFonts w:ascii="Arial" w:hAnsi="Arial"/>
+                <w:b w:val="0"/>
+                <w:sz w:val="14"/>
+              </w:rPr>
+              <w:t>6</w:t>
+            </w:r>
+          </w:p>
+        </w:tc>
+        <w:tc>
+          <w:tcPr>
+            <w:tcW w:type="dxa" w:w="1296"/>
+            <w:vAlign w:val="center"/>
+            <w:shd w:fill="EAF4F7"/>
+          </w:tcPr>
+          <w:p>
+            <w:pPr>
+              <w:jc w:val="left"/>
+            </w:pPr>
+            <w:r/>
+            <w:r>
+              <w:rPr>
+                <w:rFonts w:ascii="Arial" w:hAnsi="Arial"/>
+                <w:b w:val="0"/>
+                <w:sz w:val="14"/>
+              </w:rPr>
+              <w:t>Phase 1-4</w:t>
+            </w:r>
+          </w:p>
+        </w:tc>
+        <w:tc>
+          <w:tcPr>
+            <w:tcW w:type="dxa" w:w="2088"/>
+            <w:vAlign w:val="center"/>
+            <w:shd w:fill="EAF4F7"/>
+          </w:tcPr>
+          <w:p>
+            <w:pPr>
+              <w:jc w:val="left"/>
+            </w:pPr>
+            <w:r/>
+            <w:r>
+              <w:rPr>
+                <w:rFonts w:ascii="Arial" w:hAnsi="Arial"/>
+                <w:b w:val="0"/>
+                <w:sz w:val="14"/>
+              </w:rPr>
+              <w:t>Fieldglass Ingestion POC</w:t>
+            </w:r>
+          </w:p>
+        </w:tc>
+        <w:tc>
+          <w:tcPr>
+            <w:tcW w:type="dxa" w:w="4536"/>
+            <w:vAlign w:val="center"/>
+            <w:shd w:fill="EAF4F7"/>
+          </w:tcPr>
+          <w:p>
+            <w:pPr>
+              <w:jc w:val="left"/>
+            </w:pPr>
+            <w:r/>
+            <w:r>
+              <w:rPr>
+                <w:rFonts w:ascii="Arial" w:hAnsi="Arial"/>
+                <w:b w:val="0"/>
+                <w:sz w:val="12"/>
+              </w:rPr>
+              <w:t>Ingest roster lock/Fieldglass-ready Excel input into normalized staging data.</w:t>
+            </w:r>
+          </w:p>
+        </w:tc>
+        <w:tc>
+          <w:tcPr>
+            <w:tcW w:type="dxa" w:w="648"/>
+            <w:vAlign w:val="center"/>
+            <w:shd w:fill="EAF4F7"/>
+          </w:tcPr>
+          <w:p>
+            <w:pPr>
+              <w:jc w:val="left"/>
+            </w:pPr>
+            <w:r/>
+            <w:r>
+              <w:rPr>
+                <w:rFonts w:ascii="Arial" w:hAnsi="Arial"/>
+                <w:b w:val="0"/>
+                <w:sz w:val="14"/>
+              </w:rPr>
+              <w:t>3</w:t>
+            </w:r>
+          </w:p>
+        </w:tc>
+        <w:tc>
+          <w:tcPr>
+            <w:tcW w:type="dxa" w:w="4536"/>
+            <w:vAlign w:val="center"/>
+            <w:shd w:fill="EAF4F7"/>
+          </w:tcPr>
+          <w:p>
+            <w:pPr>
+              <w:jc w:val="left"/>
+            </w:pPr>
+            <w:r/>
+            <w:r>
+              <w:rPr>
+                <w:rFonts w:ascii="Arial" w:hAnsi="Arial"/>
+                <w:b w:val="0"/>
+                <w:sz w:val="12"/>
+              </w:rPr>
+              <w:t>Sample input produces validated staging records for worker creation and master roster updates.</w:t>
+            </w:r>
+          </w:p>
+        </w:tc>
+      </w:tr>
+      <w:tr>
+        <w:tc>
+          <w:tcPr>
+            <w:tcW w:type="dxa" w:w="504"/>
+            <w:vAlign w:val="center"/>
+            <w:shd w:fill="EAF4F7"/>
+          </w:tcPr>
+          <w:p>
+            <w:pPr>
+              <w:jc w:val="left"/>
+            </w:pPr>
+            <w:r/>
+            <w:r>
+              <w:rPr>
+                <w:rFonts w:ascii="Arial" w:hAnsi="Arial"/>
+                <w:b w:val="0"/>
+                <w:sz w:val="14"/>
+              </w:rPr>
+              <w:t>7</w:t>
+            </w:r>
+          </w:p>
+        </w:tc>
+        <w:tc>
+          <w:tcPr>
+            <w:tcW w:type="dxa" w:w="1296"/>
+            <w:vAlign w:val="center"/>
+            <w:shd w:fill="EAF4F7"/>
+          </w:tcPr>
+          <w:p>
+            <w:pPr>
+              <w:jc w:val="left"/>
+            </w:pPr>
+            <w:r/>
+            <w:r>
+              <w:rPr>
+                <w:rFonts w:ascii="Arial" w:hAnsi="Arial"/>
+                <w:b w:val="0"/>
+                <w:sz w:val="14"/>
+              </w:rPr>
+              <w:t>Phase 3, 9</w:t>
+            </w:r>
+          </w:p>
+        </w:tc>
+        <w:tc>
+          <w:tcPr>
+            <w:tcW w:type="dxa" w:w="2088"/>
+            <w:vAlign w:val="center"/>
+            <w:shd w:fill="EAF4F7"/>
+          </w:tcPr>
+          <w:p>
+            <w:pPr>
+              <w:jc w:val="left"/>
+            </w:pPr>
+            <w:r/>
+            <w:r>
+              <w:rPr>
+                <w:rFonts w:ascii="Arial" w:hAnsi="Arial"/>
+                <w:b w:val="0"/>
+                <w:sz w:val="14"/>
+              </w:rPr>
+              <w:t>User Validation &amp; Roles</w:t>
+            </w:r>
+          </w:p>
+        </w:tc>
+        <w:tc>
+          <w:tcPr>
+            <w:tcW w:type="dxa" w:w="4536"/>
+            <w:vAlign w:val="center"/>
+            <w:shd w:fill="EAF4F7"/>
+          </w:tcPr>
+          <w:p>
+            <w:pPr>
+              <w:jc w:val="left"/>
+            </w:pPr>
+            <w:r/>
+            <w:r>
+              <w:rPr>
+                <w:rFonts w:ascii="Arial" w:hAnsi="Arial"/>
+                <w:b w:val="0"/>
+                <w:sz w:val="12"/>
+              </w:rPr>
+              <w:t>Implement Windows username capture and role validation for requester, reviewer, writer/admin, auditor, and monitor roles.</w:t>
+            </w:r>
+          </w:p>
+        </w:tc>
+        <w:tc>
+          <w:tcPr>
+            <w:tcW w:type="dxa" w:w="648"/>
+            <w:vAlign w:val="center"/>
+            <w:shd w:fill="EAF4F7"/>
+          </w:tcPr>
+          <w:p>
+            <w:pPr>
+              <w:jc w:val="left"/>
+            </w:pPr>
+            <w:r/>
+            <w:r>
+              <w:rPr>
+                <w:rFonts w:ascii="Arial" w:hAnsi="Arial"/>
+                <w:b w:val="0"/>
+                <w:sz w:val="14"/>
+              </w:rPr>
+              <w:t>2</w:t>
+            </w:r>
+          </w:p>
+        </w:tc>
+        <w:tc>
+          <w:tcPr>
+            <w:tcW w:type="dxa" w:w="4536"/>
+            <w:vAlign w:val="center"/>
+            <w:shd w:fill="EAF4F7"/>
+          </w:tcPr>
+          <w:p>
+            <w:pPr>
+              <w:jc w:val="left"/>
+            </w:pPr>
+            <w:r/>
+            <w:r>
+              <w:rPr>
+                <w:rFonts w:ascii="Arial" w:hAnsi="Arial"/>
+                <w:b w:val="0"/>
+                <w:sz w:val="12"/>
+              </w:rPr>
+              <w:t>Unauthorized users are blocked and role permissions are enforced before workflow actions run.</w:t>
+            </w:r>
+          </w:p>
+        </w:tc>
+      </w:tr>
+    </w:tbl>
+    <w:p>
+      <w:r>
+        <w:rPr>
+          <w:b/>
+        </w:rPr>
+        <w:t>Week 1 - Foundation capacity:</w:t>
+      </w:r>
+      <w:r>
+        <w:t xml:space="preserve"> 20 hours.</w:t>
+      </w:r>
+    </w:p>
+    <w:p>
+      <w:pPr>
+        <w:pStyle w:val="Heading3"/>
+      </w:pPr>
+      <w:r>
+        <w:rPr>
+          <w:rFonts w:ascii="Arial" w:hAnsi="Arial"/>
+          <w:color w:val="1F4E79"/>
+        </w:rPr>
+        <w:t>Week 2 - Core Workflow</w:t>
+      </w:r>
+    </w:p>
+    <w:tbl>
+      <w:tblPr>
+        <w:tblStyle w:val="TableGrid"/>
+        <w:tblW w:type="auto" w:w="0"/>
+        <w:jc w:val="left"/>
+        <w:tblLook w:firstColumn="1" w:firstRow="1" w:lastColumn="0" w:lastRow="0" w:noHBand="0" w:noVBand="1" w:val="04A0"/>
+      </w:tblPr>
+      <w:tblGrid>
+        <w:gridCol w:w="2376"/>
+        <w:gridCol w:w="2376"/>
+        <w:gridCol w:w="2376"/>
+        <w:gridCol w:w="2376"/>
+        <w:gridCol w:w="2376"/>
+        <w:gridCol w:w="2376"/>
+      </w:tblGrid>
+      <w:tr>
+        <w:trPr>
+          <w:tblHeader w:val="true"/>
+        </w:trPr>
+        <w:tc>
+          <w:tcPr>
+            <w:tcW w:type="dxa" w:w="504"/>
+            <w:vAlign w:val="center"/>
+            <w:shd w:fill="1F4E79"/>
+          </w:tcPr>
+          <w:p>
+            <w:pPr>
+              <w:jc w:val="left"/>
+            </w:pPr>
+            <w:r/>
+            <w:r>
+              <w:rPr>
+                <w:rFonts w:ascii="Arial" w:hAnsi="Arial"/>
+                <w:b/>
+                <w:color w:val="FFFFFF"/>
+                <w:sz w:val="14"/>
+              </w:rPr>
+              <w:t>ID</w:t>
+            </w:r>
+          </w:p>
+        </w:tc>
+        <w:tc>
+          <w:tcPr>
+            <w:tcW w:type="dxa" w:w="1296"/>
+            <w:vAlign w:val="center"/>
+            <w:shd w:fill="1F4E79"/>
+          </w:tcPr>
+          <w:p>
+            <w:pPr>
+              <w:jc w:val="left"/>
+            </w:pPr>
+            <w:r/>
+            <w:r>
+              <w:rPr>
+                <w:rFonts w:ascii="Arial" w:hAnsi="Arial"/>
+                <w:b/>
+                <w:color w:val="FFFFFF"/>
+                <w:sz w:val="14"/>
+              </w:rPr>
+              <w:t>Phase</w:t>
+            </w:r>
+          </w:p>
+        </w:tc>
+        <w:tc>
+          <w:tcPr>
+            <w:tcW w:type="dxa" w:w="2088"/>
+            <w:vAlign w:val="center"/>
+            <w:shd w:fill="1F4E79"/>
+          </w:tcPr>
+          <w:p>
+            <w:pPr>
+              <w:jc w:val="left"/>
+            </w:pPr>
+            <w:r/>
+            <w:r>
+              <w:rPr>
+                <w:rFonts w:ascii="Arial" w:hAnsi="Arial"/>
+                <w:b/>
+                <w:color w:val="FFFFFF"/>
+                <w:sz w:val="14"/>
+              </w:rPr>
+              <w:t>Deliverable</w:t>
+            </w:r>
+          </w:p>
+        </w:tc>
+        <w:tc>
+          <w:tcPr>
+            <w:tcW w:type="dxa" w:w="4536"/>
+            <w:vAlign w:val="center"/>
+            <w:shd w:fill="1F4E79"/>
+          </w:tcPr>
+          <w:p>
+            <w:pPr>
+              <w:jc w:val="left"/>
+            </w:pPr>
+            <w:r/>
+            <w:r>
+              <w:rPr>
+                <w:rFonts w:ascii="Arial" w:hAnsi="Arial"/>
+                <w:b/>
+                <w:color w:val="FFFFFF"/>
+                <w:sz w:val="14"/>
+              </w:rPr>
+              <w:t>Work Item</w:t>
+            </w:r>
+          </w:p>
+        </w:tc>
+        <w:tc>
+          <w:tcPr>
+            <w:tcW w:type="dxa" w:w="648"/>
+            <w:vAlign w:val="center"/>
+            <w:shd w:fill="1F4E79"/>
+          </w:tcPr>
+          <w:p>
+            <w:pPr>
+              <w:jc w:val="left"/>
+            </w:pPr>
+            <w:r/>
+            <w:r>
+              <w:rPr>
+                <w:rFonts w:ascii="Arial" w:hAnsi="Arial"/>
+                <w:b/>
+                <w:color w:val="FFFFFF"/>
+                <w:sz w:val="14"/>
+              </w:rPr>
+              <w:t>Hours</w:t>
+            </w:r>
+          </w:p>
+        </w:tc>
+        <w:tc>
+          <w:tcPr>
+            <w:tcW w:type="dxa" w:w="4536"/>
+            <w:vAlign w:val="center"/>
+            <w:shd w:fill="1F4E79"/>
+          </w:tcPr>
+          <w:p>
+            <w:pPr>
+              <w:jc w:val="left"/>
+            </w:pPr>
+            <w:r/>
+            <w:r>
+              <w:rPr>
+                <w:rFonts w:ascii="Arial" w:hAnsi="Arial"/>
+                <w:b/>
+                <w:color w:val="FFFFFF"/>
+                <w:sz w:val="14"/>
+              </w:rPr>
+              <w:t>Done When</w:t>
+            </w:r>
+          </w:p>
+        </w:tc>
+      </w:tr>
+      <w:tr>
+        <w:tc>
+          <w:tcPr>
+            <w:tcW w:type="dxa" w:w="504"/>
+            <w:vAlign w:val="center"/>
+            <w:shd w:fill="F2ECF8"/>
+          </w:tcPr>
+          <w:p>
+            <w:pPr>
+              <w:jc w:val="left"/>
+            </w:pPr>
+            <w:r/>
+            <w:r>
+              <w:rPr>
+                <w:rFonts w:ascii="Arial" w:hAnsi="Arial"/>
+                <w:b w:val="0"/>
+                <w:sz w:val="14"/>
+              </w:rPr>
+              <w:t>8</w:t>
+            </w:r>
+          </w:p>
+        </w:tc>
+        <w:tc>
+          <w:tcPr>
+            <w:tcW w:type="dxa" w:w="1296"/>
+            <w:vAlign w:val="center"/>
+            <w:shd w:fill="F2ECF8"/>
+          </w:tcPr>
+          <w:p>
+            <w:pPr>
+              <w:jc w:val="left"/>
+            </w:pPr>
+            <w:r/>
+            <w:r>
+              <w:rPr>
+                <w:rFonts w:ascii="Arial" w:hAnsi="Arial"/>
+                <w:b w:val="0"/>
+                <w:sz w:val="14"/>
+              </w:rPr>
+              <w:t>Phase 8</w:t>
+            </w:r>
+          </w:p>
+        </w:tc>
+        <w:tc>
+          <w:tcPr>
+            <w:tcW w:type="dxa" w:w="2088"/>
+            <w:vAlign w:val="center"/>
+            <w:shd w:fill="F2ECF8"/>
+          </w:tcPr>
+          <w:p>
+            <w:pPr>
+              <w:jc w:val="left"/>
+            </w:pPr>
+            <w:r/>
+            <w:r>
+              <w:rPr>
+                <w:rFonts w:ascii="Arial" w:hAnsi="Arial"/>
+                <w:b w:val="0"/>
+                <w:sz w:val="14"/>
+              </w:rPr>
+              <w:t>CRUD Request Workflows</w:t>
+            </w:r>
+          </w:p>
+        </w:tc>
+        <w:tc>
+          <w:tcPr>
+            <w:tcW w:type="dxa" w:w="4536"/>
+            <w:vAlign w:val="center"/>
+            <w:shd w:fill="F2ECF8"/>
+          </w:tcPr>
+          <w:p>
+            <w:pPr>
+              <w:jc w:val="left"/>
+            </w:pPr>
+            <w:r/>
+            <w:r>
+              <w:rPr>
+                <w:rFonts w:ascii="Arial" w:hAnsi="Arial"/>
+                <w:b w:val="0"/>
+                <w:sz w:val="12"/>
+              </w:rPr>
+              <w:t>Implement create, update, deactivate, and view/search workflows as immutable request-driven operations for agent lifecycle changes.</w:t>
+            </w:r>
+          </w:p>
+        </w:tc>
+        <w:tc>
+          <w:tcPr>
+            <w:tcW w:type="dxa" w:w="648"/>
+            <w:vAlign w:val="center"/>
+            <w:shd w:fill="F2ECF8"/>
+          </w:tcPr>
+          <w:p>
+            <w:pPr>
+              <w:jc w:val="left"/>
+            </w:pPr>
+            <w:r/>
+            <w:r>
+              <w:rPr>
+                <w:rFonts w:ascii="Arial" w:hAnsi="Arial"/>
+                <w:b w:val="0"/>
+                <w:sz w:val="14"/>
+              </w:rPr>
+              <w:t>4</w:t>
+            </w:r>
+          </w:p>
+        </w:tc>
+        <w:tc>
+          <w:tcPr>
+            <w:tcW w:type="dxa" w:w="4536"/>
+            <w:vAlign w:val="center"/>
+            <w:shd w:fill="F2ECF8"/>
+          </w:tcPr>
+          <w:p>
+            <w:pPr>
+              <w:jc w:val="left"/>
+            </w:pPr>
+            <w:r/>
+            <w:r>
+              <w:rPr>
+                <w:rFonts w:ascii="Arial" w:hAnsi="Arial"/>
+                <w:b w:val="0"/>
+                <w:sz w:val="12"/>
+              </w:rPr>
+              <w:t>CRUD actions generate valid requests and never directly modify the master Access snapshot.</w:t>
+            </w:r>
+          </w:p>
+        </w:tc>
+      </w:tr>
+      <w:tr>
+        <w:tc>
+          <w:tcPr>
+            <w:tcW w:type="dxa" w:w="504"/>
+            <w:vAlign w:val="center"/>
+            <w:shd w:fill="F2ECF8"/>
+          </w:tcPr>
+          <w:p>
+            <w:pPr>
+              <w:jc w:val="left"/>
+            </w:pPr>
+            <w:r/>
+            <w:r>
+              <w:rPr>
+                <w:rFonts w:ascii="Arial" w:hAnsi="Arial"/>
+                <w:b w:val="0"/>
+                <w:sz w:val="14"/>
+              </w:rPr>
+              <w:t>9</w:t>
+            </w:r>
+          </w:p>
+        </w:tc>
+        <w:tc>
+          <w:tcPr>
+            <w:tcW w:type="dxa" w:w="1296"/>
+            <w:vAlign w:val="center"/>
+            <w:shd w:fill="F2ECF8"/>
+          </w:tcPr>
+          <w:p>
+            <w:pPr>
+              <w:jc w:val="left"/>
+            </w:pPr>
+            <w:r/>
+            <w:r>
+              <w:rPr>
+                <w:rFonts w:ascii="Arial" w:hAnsi="Arial"/>
+                <w:b w:val="0"/>
+                <w:sz w:val="14"/>
+              </w:rPr>
+              <w:t>Phase 2-3</w:t>
+            </w:r>
+          </w:p>
+        </w:tc>
+        <w:tc>
+          <w:tcPr>
+            <w:tcW w:type="dxa" w:w="2088"/>
+            <w:vAlign w:val="center"/>
+            <w:shd w:fill="F2ECF8"/>
+          </w:tcPr>
+          <w:p>
+            <w:pPr>
+              <w:jc w:val="left"/>
+            </w:pPr>
+            <w:r/>
+            <w:r>
+              <w:rPr>
+                <w:rFonts w:ascii="Arial" w:hAnsi="Arial"/>
+                <w:b w:val="0"/>
+                <w:sz w:val="14"/>
+              </w:rPr>
+              <w:t>Admin Import, Idempotency &amp; Quarantine</w:t>
+            </w:r>
+          </w:p>
+        </w:tc>
+        <w:tc>
+          <w:tcPr>
+            <w:tcW w:type="dxa" w:w="4536"/>
+            <w:vAlign w:val="center"/>
+            <w:shd w:fill="F2ECF8"/>
+          </w:tcPr>
+          <w:p>
+            <w:pPr>
+              <w:jc w:val="left"/>
+            </w:pPr>
+            <w:r/>
+            <w:r>
+              <w:rPr>
+                <w:rFonts w:ascii="Arial" w:hAnsi="Arial"/>
+                <w:b w:val="0"/>
+                <w:sz w:val="12"/>
+              </w:rPr>
+              <w:t>Import pending requests and inbound files, detect duplicates, maintain processed registry, and quarantine invalid inputs.</w:t>
+            </w:r>
+          </w:p>
+        </w:tc>
+        <w:tc>
+          <w:tcPr>
+            <w:tcW w:type="dxa" w:w="648"/>
+            <w:vAlign w:val="center"/>
+            <w:shd w:fill="F2ECF8"/>
+          </w:tcPr>
+          <w:p>
+            <w:pPr>
+              <w:jc w:val="left"/>
+            </w:pPr>
+            <w:r/>
+            <w:r>
+              <w:rPr>
+                <w:rFonts w:ascii="Arial" w:hAnsi="Arial"/>
+                <w:b w:val="0"/>
+                <w:sz w:val="14"/>
+              </w:rPr>
+              <w:t>3</w:t>
+            </w:r>
+          </w:p>
+        </w:tc>
+        <w:tc>
+          <w:tcPr>
+            <w:tcW w:type="dxa" w:w="4536"/>
+            <w:vAlign w:val="center"/>
+            <w:shd w:fill="F2ECF8"/>
+          </w:tcPr>
+          <w:p>
+            <w:pPr>
+              <w:jc w:val="left"/>
+            </w:pPr>
+            <w:r/>
+            <w:r>
+              <w:rPr>
+                <w:rFonts w:ascii="Arial" w:hAnsi="Arial"/>
+                <w:b w:val="0"/>
+                <w:sz w:val="12"/>
+              </w:rPr>
+              <w:t>Duplicate request/file IDs are rejected safely; malformed files move to quarantine with reason captured.</w:t>
+            </w:r>
+          </w:p>
+        </w:tc>
+      </w:tr>
+      <w:tr>
+        <w:tc>
+          <w:tcPr>
+            <w:tcW w:type="dxa" w:w="504"/>
+            <w:vAlign w:val="center"/>
+            <w:shd w:fill="F2ECF8"/>
+          </w:tcPr>
+          <w:p>
+            <w:pPr>
+              <w:jc w:val="left"/>
+            </w:pPr>
+            <w:r/>
+            <w:r>
+              <w:rPr>
+                <w:rFonts w:ascii="Arial" w:hAnsi="Arial"/>
+                <w:b w:val="0"/>
+                <w:sz w:val="14"/>
+              </w:rPr>
+              <w:t>10</w:t>
+            </w:r>
+          </w:p>
+        </w:tc>
+        <w:tc>
+          <w:tcPr>
+            <w:tcW w:type="dxa" w:w="1296"/>
+            <w:vAlign w:val="center"/>
+            <w:shd w:fill="F2ECF8"/>
+          </w:tcPr>
+          <w:p>
+            <w:pPr>
+              <w:jc w:val="left"/>
+            </w:pPr>
+            <w:r/>
+            <w:r>
+              <w:rPr>
+                <w:rFonts w:ascii="Arial" w:hAnsi="Arial"/>
+                <w:b w:val="0"/>
+                <w:sz w:val="14"/>
+              </w:rPr>
+              <w:t>Phase 3-4</w:t>
+            </w:r>
+          </w:p>
+        </w:tc>
+        <w:tc>
+          <w:tcPr>
+            <w:tcW w:type="dxa" w:w="2088"/>
+            <w:vAlign w:val="center"/>
+            <w:shd w:fill="F2ECF8"/>
+          </w:tcPr>
+          <w:p>
+            <w:pPr>
+              <w:jc w:val="left"/>
+            </w:pPr>
+            <w:r/>
+            <w:r>
+              <w:rPr>
+                <w:rFonts w:ascii="Arial" w:hAnsi="Arial"/>
+                <w:b w:val="0"/>
+                <w:sz w:val="14"/>
+              </w:rPr>
+              <w:t>Approval Workflow</w:t>
+            </w:r>
+          </w:p>
+        </w:tc>
+        <w:tc>
+          <w:tcPr>
+            <w:tcW w:type="dxa" w:w="4536"/>
+            <w:vAlign w:val="center"/>
+            <w:shd w:fill="F2ECF8"/>
+          </w:tcPr>
+          <w:p>
+            <w:pPr>
+              <w:jc w:val="left"/>
+            </w:pPr>
+            <w:r/>
+            <w:r>
+              <w:rPr>
+                <w:rFonts w:ascii="Arial" w:hAnsi="Arial"/>
+                <w:b w:val="0"/>
+                <w:sz w:val="12"/>
+              </w:rPr>
+              <w:t>Implement review, approve, reject, conflict, and decision notes for onboarding and post-onboarding requests.</w:t>
+            </w:r>
+          </w:p>
+        </w:tc>
+        <w:tc>
+          <w:tcPr>
+            <w:tcW w:type="dxa" w:w="648"/>
+            <w:vAlign w:val="center"/>
+            <w:shd w:fill="F2ECF8"/>
+          </w:tcPr>
+          <w:p>
+            <w:pPr>
+              <w:jc w:val="left"/>
+            </w:pPr>
+            <w:r/>
+            <w:r>
+              <w:rPr>
+                <w:rFonts w:ascii="Arial" w:hAnsi="Arial"/>
+                <w:b w:val="0"/>
+                <w:sz w:val="14"/>
+              </w:rPr>
+              <w:t>3</w:t>
+            </w:r>
+          </w:p>
+        </w:tc>
+        <w:tc>
+          <w:tcPr>
+            <w:tcW w:type="dxa" w:w="4536"/>
+            <w:vAlign w:val="center"/>
+            <w:shd w:fill="F2ECF8"/>
+          </w:tcPr>
+          <w:p>
+            <w:pPr>
+              <w:jc w:val="left"/>
+            </w:pPr>
+            <w:r/>
+            <w:r>
+              <w:rPr>
+                <w:rFonts w:ascii="Arial" w:hAnsi="Arial"/>
+                <w:b w:val="0"/>
+                <w:sz w:val="12"/>
+              </w:rPr>
+              <w:t>Reviewer/admin decisions are recorded; segregation rules prevent unauthorized self-approval when enabled.</w:t>
+            </w:r>
+          </w:p>
+        </w:tc>
+      </w:tr>
+      <w:tr>
+        <w:tc>
+          <w:tcPr>
+            <w:tcW w:type="dxa" w:w="504"/>
+            <w:vAlign w:val="center"/>
+            <w:shd w:fill="F2ECF8"/>
+          </w:tcPr>
+          <w:p>
+            <w:pPr>
+              <w:jc w:val="left"/>
+            </w:pPr>
+            <w:r/>
+            <w:r>
+              <w:rPr>
+                <w:rFonts w:ascii="Arial" w:hAnsi="Arial"/>
+                <w:b w:val="0"/>
+                <w:sz w:val="14"/>
+              </w:rPr>
+              <w:t>11</w:t>
+            </w:r>
+          </w:p>
+        </w:tc>
+        <w:tc>
+          <w:tcPr>
+            <w:tcW w:type="dxa" w:w="1296"/>
+            <w:vAlign w:val="center"/>
+            <w:shd w:fill="F2ECF8"/>
+          </w:tcPr>
+          <w:p>
+            <w:pPr>
+              <w:jc w:val="left"/>
+            </w:pPr>
+            <w:r/>
+            <w:r>
+              <w:rPr>
+                <w:rFonts w:ascii="Arial" w:hAnsi="Arial"/>
+                <w:b w:val="0"/>
+                <w:sz w:val="14"/>
+              </w:rPr>
+              <w:t>Phase 4-5</w:t>
+            </w:r>
+          </w:p>
+        </w:tc>
+        <w:tc>
+          <w:tcPr>
+            <w:tcW w:type="dxa" w:w="2088"/>
+            <w:vAlign w:val="center"/>
+            <w:shd w:fill="F2ECF8"/>
+          </w:tcPr>
+          <w:p>
+            <w:pPr>
+              <w:jc w:val="left"/>
+            </w:pPr>
+            <w:r/>
+            <w:r>
+              <w:rPr>
+                <w:rFonts w:ascii="Arial" w:hAnsi="Arial"/>
+                <w:b w:val="0"/>
+                <w:sz w:val="14"/>
+              </w:rPr>
+              <w:t>Apply Approved Changes</w:t>
+            </w:r>
+          </w:p>
+        </w:tc>
+        <w:tc>
+          <w:tcPr>
+            <w:tcW w:type="dxa" w:w="4536"/>
+            <w:vAlign w:val="center"/>
+            <w:shd w:fill="F2ECF8"/>
+          </w:tcPr>
+          <w:p>
+            <w:pPr>
+              <w:jc w:val="left"/>
+            </w:pPr>
+            <w:r/>
+            <w:r>
+              <w:rPr>
+                <w:rFonts w:ascii="Arial" w:hAnsi="Arial"/>
+                <w:b w:val="0"/>
+                <w:sz w:val="12"/>
+              </w:rPr>
+              <w:t>Apply approved requests to a local Access working copy with record-version checks, referential validation, NUID fields, and status transitions.</w:t>
+            </w:r>
+          </w:p>
+        </w:tc>
+        <w:tc>
+          <w:tcPr>
+            <w:tcW w:type="dxa" w:w="648"/>
+            <w:vAlign w:val="center"/>
+            <w:shd w:fill="F2ECF8"/>
+          </w:tcPr>
+          <w:p>
+            <w:pPr>
+              <w:jc w:val="left"/>
+            </w:pPr>
+            <w:r/>
+            <w:r>
+              <w:rPr>
+                <w:rFonts w:ascii="Arial" w:hAnsi="Arial"/>
+                <w:b w:val="0"/>
+                <w:sz w:val="14"/>
+              </w:rPr>
+              <w:t>4</w:t>
+            </w:r>
+          </w:p>
+        </w:tc>
+        <w:tc>
+          <w:tcPr>
+            <w:tcW w:type="dxa" w:w="4536"/>
+            <w:vAlign w:val="center"/>
+            <w:shd w:fill="F2ECF8"/>
+          </w:tcPr>
+          <w:p>
+            <w:pPr>
+              <w:jc w:val="left"/>
+            </w:pPr>
+            <w:r/>
+            <w:r>
+              <w:rPr>
+                <w:rFonts w:ascii="Arial" w:hAnsi="Arial"/>
+                <w:b w:val="0"/>
+                <w:sz w:val="12"/>
+              </w:rPr>
+              <w:t>Matching versions apply; stale versions become conflicts; invalid references fail cleanly.</w:t>
+            </w:r>
+          </w:p>
+        </w:tc>
+      </w:tr>
+      <w:tr>
+        <w:tc>
+          <w:tcPr>
+            <w:tcW w:type="dxa" w:w="504"/>
+            <w:vAlign w:val="center"/>
+            <w:shd w:fill="F2ECF8"/>
+          </w:tcPr>
+          <w:p>
+            <w:pPr>
+              <w:jc w:val="left"/>
+            </w:pPr>
+            <w:r/>
+            <w:r>
+              <w:rPr>
+                <w:rFonts w:ascii="Arial" w:hAnsi="Arial"/>
+                <w:b w:val="0"/>
+                <w:sz w:val="14"/>
+              </w:rPr>
+              <w:t>12</w:t>
+            </w:r>
+          </w:p>
+        </w:tc>
+        <w:tc>
+          <w:tcPr>
+            <w:tcW w:type="dxa" w:w="1296"/>
+            <w:vAlign w:val="center"/>
+            <w:shd w:fill="F2ECF8"/>
+          </w:tcPr>
+          <w:p>
+            <w:pPr>
+              <w:jc w:val="left"/>
+            </w:pPr>
+            <w:r/>
+            <w:r>
+              <w:rPr>
+                <w:rFonts w:ascii="Arial" w:hAnsi="Arial"/>
+                <w:b w:val="0"/>
+                <w:sz w:val="14"/>
+              </w:rPr>
+              <w:t>Phase 5</w:t>
+            </w:r>
+          </w:p>
+        </w:tc>
+        <w:tc>
+          <w:tcPr>
+            <w:tcW w:type="dxa" w:w="2088"/>
+            <w:vAlign w:val="center"/>
+            <w:shd w:fill="F2ECF8"/>
+          </w:tcPr>
+          <w:p>
+            <w:pPr>
+              <w:jc w:val="left"/>
+            </w:pPr>
+            <w:r/>
+            <w:r>
+              <w:rPr>
+                <w:rFonts w:ascii="Arial" w:hAnsi="Arial"/>
+                <w:b w:val="0"/>
+                <w:sz w:val="14"/>
+              </w:rPr>
+              <w:t>Master Roster Creation &amp; Enrichment</w:t>
+            </w:r>
+          </w:p>
+        </w:tc>
+        <w:tc>
+          <w:tcPr>
+            <w:tcW w:type="dxa" w:w="4536"/>
+            <w:vAlign w:val="center"/>
+            <w:shd w:fill="F2ECF8"/>
+          </w:tcPr>
+          <w:p>
+            <w:pPr>
+              <w:jc w:val="left"/>
+            </w:pPr>
+            <w:r/>
+            <w:r>
+              <w:rPr>
+                <w:rFonts w:ascii="Arial" w:hAnsi="Arial"/>
+                <w:b w:val="0"/>
+                <w:sz w:val="12"/>
+              </w:rPr>
+              <w:t>Convert validated Fieldglass/onboarding data into the official master roster and enrich NUID, status, training/nesting/production, and timeline indicators.</w:t>
+            </w:r>
+          </w:p>
+        </w:tc>
+        <w:tc>
+          <w:tcPr>
+            <w:tcW w:type="dxa" w:w="648"/>
+            <w:vAlign w:val="center"/>
+            <w:shd w:fill="F2ECF8"/>
+          </w:tcPr>
+          <w:p>
+            <w:pPr>
+              <w:jc w:val="left"/>
+            </w:pPr>
+            <w:r/>
+            <w:r>
+              <w:rPr>
+                <w:rFonts w:ascii="Arial" w:hAnsi="Arial"/>
+                <w:b w:val="0"/>
+                <w:sz w:val="14"/>
+              </w:rPr>
+              <w:t>2</w:t>
+            </w:r>
+          </w:p>
+        </w:tc>
+        <w:tc>
+          <w:tcPr>
+            <w:tcW w:type="dxa" w:w="4536"/>
+            <w:vAlign w:val="center"/>
+            <w:shd w:fill="F2ECF8"/>
+          </w:tcPr>
+          <w:p>
+            <w:pPr>
+              <w:jc w:val="left"/>
+            </w:pPr>
+            <w:r/>
+            <w:r>
+              <w:rPr>
+                <w:rFonts w:ascii="Arial" w:hAnsi="Arial"/>
+                <w:b w:val="0"/>
+                <w:sz w:val="12"/>
+              </w:rPr>
+              <w:t>Master roster records are generated or updated with required enrichment fields.</w:t>
+            </w:r>
+          </w:p>
+        </w:tc>
+      </w:tr>
+      <w:tr>
+        <w:tc>
+          <w:tcPr>
+            <w:tcW w:type="dxa" w:w="504"/>
+            <w:vAlign w:val="center"/>
+            <w:shd w:fill="F2ECF8"/>
+          </w:tcPr>
+          <w:p>
+            <w:pPr>
+              <w:jc w:val="left"/>
+            </w:pPr>
+            <w:r/>
+            <w:r>
+              <w:rPr>
+                <w:rFonts w:ascii="Arial" w:hAnsi="Arial"/>
+                <w:b w:val="0"/>
+                <w:sz w:val="14"/>
+              </w:rPr>
+              <w:t>13</w:t>
+            </w:r>
+          </w:p>
+        </w:tc>
+        <w:tc>
+          <w:tcPr>
+            <w:tcW w:type="dxa" w:w="1296"/>
+            <w:vAlign w:val="center"/>
+            <w:shd w:fill="F2ECF8"/>
+          </w:tcPr>
+          <w:p>
+            <w:pPr>
+              <w:jc w:val="left"/>
+            </w:pPr>
+            <w:r/>
+            <w:r>
+              <w:rPr>
+                <w:rFonts w:ascii="Arial" w:hAnsi="Arial"/>
+                <w:b w:val="0"/>
+                <w:sz w:val="14"/>
+              </w:rPr>
+              <w:t>Phase 4, 9</w:t>
+            </w:r>
+          </w:p>
+        </w:tc>
+        <w:tc>
+          <w:tcPr>
+            <w:tcW w:type="dxa" w:w="2088"/>
+            <w:vAlign w:val="center"/>
+            <w:shd w:fill="F2ECF8"/>
+          </w:tcPr>
+          <w:p>
+            <w:pPr>
+              <w:jc w:val="left"/>
+            </w:pPr>
+            <w:r/>
+            <w:r>
+              <w:rPr>
+                <w:rFonts w:ascii="Arial" w:hAnsi="Arial"/>
+                <w:b w:val="0"/>
+                <w:sz w:val="14"/>
+              </w:rPr>
+              <w:t>Audit / Bitacora</w:t>
+            </w:r>
+          </w:p>
+        </w:tc>
+        <w:tc>
+          <w:tcPr>
+            <w:tcW w:type="dxa" w:w="4536"/>
+            <w:vAlign w:val="center"/>
+            <w:shd w:fill="F2ECF8"/>
+          </w:tcPr>
+          <w:p>
+            <w:pPr>
+              <w:jc w:val="left"/>
+            </w:pPr>
+            <w:r/>
+            <w:r>
+              <w:rPr>
+                <w:rFonts w:ascii="Arial" w:hAnsi="Arial"/>
+                <w:b w:val="0"/>
+                <w:sz w:val="12"/>
+              </w:rPr>
+              <w:t>Write audit events for ingest, validation, request creation, approval, rejection, apply, conflict, export, publish, failure, and recovery.</w:t>
+            </w:r>
+          </w:p>
+        </w:tc>
+        <w:tc>
+          <w:tcPr>
+            <w:tcW w:type="dxa" w:w="648"/>
+            <w:vAlign w:val="center"/>
+            <w:shd w:fill="F2ECF8"/>
+          </w:tcPr>
+          <w:p>
+            <w:pPr>
+              <w:jc w:val="left"/>
+            </w:pPr>
+            <w:r/>
+            <w:r>
+              <w:rPr>
+                <w:rFonts w:ascii="Arial" w:hAnsi="Arial"/>
+                <w:b w:val="0"/>
+                <w:sz w:val="14"/>
+              </w:rPr>
+              <w:t>2</w:t>
+            </w:r>
+          </w:p>
+        </w:tc>
+        <w:tc>
+          <w:tcPr>
+            <w:tcW w:type="dxa" w:w="4536"/>
+            <w:vAlign w:val="center"/>
+            <w:shd w:fill="F2ECF8"/>
+          </w:tcPr>
+          <w:p>
+            <w:pPr>
+              <w:jc w:val="left"/>
+            </w:pPr>
+            <w:r/>
+            <w:r>
+              <w:rPr>
+                <w:rFonts w:ascii="Arial" w:hAnsi="Arial"/>
+                <w:b w:val="0"/>
+                <w:sz w:val="12"/>
+              </w:rPr>
+              <w:t>Audit records include actor, role, computer, request ID, batch ID, entity, result, timestamp, and error details.</w:t>
+            </w:r>
+          </w:p>
+        </w:tc>
+      </w:tr>
+      <w:tr>
+        <w:tc>
+          <w:tcPr>
+            <w:tcW w:type="dxa" w:w="504"/>
+            <w:vAlign w:val="center"/>
+            <w:shd w:fill="F2ECF8"/>
+          </w:tcPr>
+          <w:p>
+            <w:pPr>
+              <w:jc w:val="left"/>
+            </w:pPr>
+            <w:r/>
+            <w:r>
+              <w:rPr>
+                <w:rFonts w:ascii="Arial" w:hAnsi="Arial"/>
+                <w:b w:val="0"/>
+                <w:sz w:val="14"/>
+              </w:rPr>
+              <w:t>14</w:t>
+            </w:r>
+          </w:p>
+        </w:tc>
+        <w:tc>
+          <w:tcPr>
+            <w:tcW w:type="dxa" w:w="1296"/>
+            <w:vAlign w:val="center"/>
+            <w:shd w:fill="F2ECF8"/>
+          </w:tcPr>
+          <w:p>
+            <w:pPr>
+              <w:jc w:val="left"/>
+            </w:pPr>
+            <w:r/>
+            <w:r>
+              <w:rPr>
+                <w:rFonts w:ascii="Arial" w:hAnsi="Arial"/>
+                <w:b w:val="0"/>
+                <w:sz w:val="14"/>
+              </w:rPr>
+              <w:t>Phase 4, 7</w:t>
+            </w:r>
+          </w:p>
+        </w:tc>
+        <w:tc>
+          <w:tcPr>
+            <w:tcW w:type="dxa" w:w="2088"/>
+            <w:vAlign w:val="center"/>
+            <w:shd w:fill="F2ECF8"/>
+          </w:tcPr>
+          <w:p>
+            <w:pPr>
+              <w:jc w:val="left"/>
+            </w:pPr>
+            <w:r/>
+            <w:r>
+              <w:rPr>
+                <w:rFonts w:ascii="Arial" w:hAnsi="Arial"/>
+                <w:b w:val="0"/>
+                <w:sz w:val="14"/>
+              </w:rPr>
+              <w:t>Fieldglass Worker Creation / Export</w:t>
+            </w:r>
+          </w:p>
+        </w:tc>
+        <w:tc>
+          <w:tcPr>
+            <w:tcW w:type="dxa" w:w="4536"/>
+            <w:vAlign w:val="center"/>
+            <w:shd w:fill="F2ECF8"/>
+          </w:tcPr>
+          <w:p>
+            <w:pPr>
+              <w:jc w:val="left"/>
+            </w:pPr>
+            <w:r/>
+            <w:r>
+              <w:rPr>
+                <w:rFonts w:ascii="Arial" w:hAnsi="Arial"/>
+                <w:b w:val="0"/>
+                <w:sz w:val="12"/>
+              </w:rPr>
+              <w:t>Generate the Fieldglass worker creation or load file from approved/applied data using configured template mappings.</w:t>
+            </w:r>
+          </w:p>
+        </w:tc>
+        <w:tc>
+          <w:tcPr>
+            <w:tcW w:type="dxa" w:w="648"/>
+            <w:vAlign w:val="center"/>
+            <w:shd w:fill="F2ECF8"/>
+          </w:tcPr>
+          <w:p>
+            <w:pPr>
+              <w:jc w:val="left"/>
+            </w:pPr>
+            <w:r/>
+            <w:r>
+              <w:rPr>
+                <w:rFonts w:ascii="Arial" w:hAnsi="Arial"/>
+                <w:b w:val="0"/>
+                <w:sz w:val="14"/>
+              </w:rPr>
+              <w:t>2</w:t>
+            </w:r>
+          </w:p>
+        </w:tc>
+        <w:tc>
+          <w:tcPr>
+            <w:tcW w:type="dxa" w:w="4536"/>
+            <w:vAlign w:val="center"/>
+            <w:shd w:fill="F2ECF8"/>
+          </w:tcPr>
+          <w:p>
+            <w:pPr>
+              <w:jc w:val="left"/>
+            </w:pPr>
+            <w:r/>
+            <w:r>
+              <w:rPr>
+                <w:rFonts w:ascii="Arial" w:hAnsi="Arial"/>
+                <w:b w:val="0"/>
+                <w:sz w:val="12"/>
+              </w:rPr>
+              <w:t>Output workbook preserves template structure and passes required-field/header validation.</w:t>
+            </w:r>
+          </w:p>
+        </w:tc>
+      </w:tr>
+    </w:tbl>
+    <w:p>
+      <w:r>
+        <w:rPr>
+          <w:b/>
+        </w:rPr>
+        <w:t>Week 2 - Core Workflow capacity:</w:t>
+      </w:r>
+      <w:r>
+        <w:t xml:space="preserve"> 20 hours.</w:t>
+      </w:r>
+    </w:p>
+    <w:p>
+      <w:pPr>
+        <w:pStyle w:val="Heading3"/>
+      </w:pPr>
+      <w:r>
+        <w:rPr>
+          <w:rFonts w:ascii="Arial" w:hAnsi="Arial"/>
+          <w:color w:val="1F4E79"/>
+        </w:rPr>
+        <w:t>Week 3 - Validation, UAT &amp; Handoff</w:t>
+      </w:r>
+    </w:p>
+    <w:tbl>
+      <w:tblPr>
+        <w:tblStyle w:val="TableGrid"/>
+        <w:tblW w:type="auto" w:w="0"/>
+        <w:jc w:val="left"/>
+        <w:tblLook w:firstColumn="1" w:firstRow="1" w:lastColumn="0" w:lastRow="0" w:noHBand="0" w:noVBand="1" w:val="04A0"/>
+      </w:tblPr>
+      <w:tblGrid>
+        <w:gridCol w:w="2376"/>
+        <w:gridCol w:w="2376"/>
+        <w:gridCol w:w="2376"/>
+        <w:gridCol w:w="2376"/>
+        <w:gridCol w:w="2376"/>
+        <w:gridCol w:w="2376"/>
+      </w:tblGrid>
+      <w:tr>
+        <w:trPr>
+          <w:tblHeader w:val="true"/>
+        </w:trPr>
+        <w:tc>
+          <w:tcPr>
+            <w:tcW w:type="dxa" w:w="504"/>
+            <w:vAlign w:val="center"/>
+            <w:shd w:fill="1F4E79"/>
+          </w:tcPr>
+          <w:p>
+            <w:pPr>
+              <w:jc w:val="left"/>
+            </w:pPr>
+            <w:r/>
+            <w:r>
+              <w:rPr>
+                <w:rFonts w:ascii="Arial" w:hAnsi="Arial"/>
+                <w:b/>
+                <w:color w:val="FFFFFF"/>
+                <w:sz w:val="14"/>
+              </w:rPr>
+              <w:t>ID</w:t>
+            </w:r>
+          </w:p>
+        </w:tc>
+        <w:tc>
+          <w:tcPr>
+            <w:tcW w:type="dxa" w:w="1296"/>
+            <w:vAlign w:val="center"/>
+            <w:shd w:fill="1F4E79"/>
+          </w:tcPr>
+          <w:p>
+            <w:pPr>
+              <w:jc w:val="left"/>
+            </w:pPr>
+            <w:r/>
+            <w:r>
+              <w:rPr>
+                <w:rFonts w:ascii="Arial" w:hAnsi="Arial"/>
+                <w:b/>
+                <w:color w:val="FFFFFF"/>
+                <w:sz w:val="14"/>
+              </w:rPr>
+              <w:t>Phase</w:t>
+            </w:r>
+          </w:p>
+        </w:tc>
+        <w:tc>
+          <w:tcPr>
+            <w:tcW w:type="dxa" w:w="2088"/>
+            <w:vAlign w:val="center"/>
+            <w:shd w:fill="1F4E79"/>
+          </w:tcPr>
+          <w:p>
+            <w:pPr>
+              <w:jc w:val="left"/>
+            </w:pPr>
+            <w:r/>
+            <w:r>
+              <w:rPr>
+                <w:rFonts w:ascii="Arial" w:hAnsi="Arial"/>
+                <w:b/>
+                <w:color w:val="FFFFFF"/>
+                <w:sz w:val="14"/>
+              </w:rPr>
+              <w:t>Deliverable</w:t>
+            </w:r>
+          </w:p>
+        </w:tc>
+        <w:tc>
+          <w:tcPr>
+            <w:tcW w:type="dxa" w:w="4536"/>
+            <w:vAlign w:val="center"/>
+            <w:shd w:fill="1F4E79"/>
+          </w:tcPr>
+          <w:p>
+            <w:pPr>
+              <w:jc w:val="left"/>
+            </w:pPr>
+            <w:r/>
+            <w:r>
+              <w:rPr>
+                <w:rFonts w:ascii="Arial" w:hAnsi="Arial"/>
+                <w:b/>
+                <w:color w:val="FFFFFF"/>
+                <w:sz w:val="14"/>
+              </w:rPr>
+              <w:t>Work Item</w:t>
+            </w:r>
+          </w:p>
+        </w:tc>
+        <w:tc>
+          <w:tcPr>
+            <w:tcW w:type="dxa" w:w="648"/>
+            <w:vAlign w:val="center"/>
+            <w:shd w:fill="1F4E79"/>
+          </w:tcPr>
+          <w:p>
+            <w:pPr>
+              <w:jc w:val="left"/>
+            </w:pPr>
+            <w:r/>
+            <w:r>
+              <w:rPr>
+                <w:rFonts w:ascii="Arial" w:hAnsi="Arial"/>
+                <w:b/>
+                <w:color w:val="FFFFFF"/>
+                <w:sz w:val="14"/>
+              </w:rPr>
+              <w:t>Hours</w:t>
+            </w:r>
+          </w:p>
+        </w:tc>
+        <w:tc>
+          <w:tcPr>
+            <w:tcW w:type="dxa" w:w="4536"/>
+            <w:vAlign w:val="center"/>
+            <w:shd w:fill="1F4E79"/>
+          </w:tcPr>
+          <w:p>
+            <w:pPr>
+              <w:jc w:val="left"/>
+            </w:pPr>
+            <w:r/>
+            <w:r>
+              <w:rPr>
+                <w:rFonts w:ascii="Arial" w:hAnsi="Arial"/>
+                <w:b/>
+                <w:color w:val="FFFFFF"/>
+                <w:sz w:val="14"/>
+              </w:rPr>
+              <w:t>Done When</w:t>
+            </w:r>
+          </w:p>
+        </w:tc>
+      </w:tr>
+      <w:tr>
+        <w:tc>
+          <w:tcPr>
+            <w:tcW w:type="dxa" w:w="504"/>
+            <w:vAlign w:val="center"/>
+            <w:shd w:fill="FDF2E6"/>
+          </w:tcPr>
+          <w:p>
+            <w:pPr>
+              <w:jc w:val="left"/>
+            </w:pPr>
+            <w:r/>
+            <w:r>
+              <w:rPr>
+                <w:rFonts w:ascii="Arial" w:hAnsi="Arial"/>
+                <w:b w:val="0"/>
+                <w:sz w:val="14"/>
+              </w:rPr>
+              <w:t>15</w:t>
+            </w:r>
+          </w:p>
+        </w:tc>
+        <w:tc>
+          <w:tcPr>
+            <w:tcW w:type="dxa" w:w="1296"/>
+            <w:vAlign w:val="center"/>
+            <w:shd w:fill="FDF2E6"/>
+          </w:tcPr>
+          <w:p>
+            <w:pPr>
+              <w:jc w:val="left"/>
+            </w:pPr>
+            <w:r/>
+            <w:r>
+              <w:rPr>
+                <w:rFonts w:ascii="Arial" w:hAnsi="Arial"/>
+                <w:b w:val="0"/>
+                <w:sz w:val="14"/>
+              </w:rPr>
+              <w:t>Phase 6-7</w:t>
+            </w:r>
+          </w:p>
+        </w:tc>
+        <w:tc>
+          <w:tcPr>
+            <w:tcW w:type="dxa" w:w="2088"/>
+            <w:vAlign w:val="center"/>
+            <w:shd w:fill="FDF2E6"/>
+          </w:tcPr>
+          <w:p>
+            <w:pPr>
+              <w:jc w:val="left"/>
+            </w:pPr>
+            <w:r/>
+            <w:r>
+              <w:rPr>
+                <w:rFonts w:ascii="Arial" w:hAnsi="Arial"/>
+                <w:b w:val="0"/>
+                <w:sz w:val="14"/>
+              </w:rPr>
+              <w:t>NICE IEX Configuration &amp; Agent Creation Package</w:t>
+            </w:r>
+          </w:p>
+        </w:tc>
+        <w:tc>
+          <w:tcPr>
+            <w:tcW w:type="dxa" w:w="4536"/>
+            <w:vAlign w:val="center"/>
+            <w:shd w:fill="FDF2E6"/>
+          </w:tcPr>
+          <w:p>
+            <w:pPr>
+              <w:jc w:val="left"/>
+            </w:pPr>
+            <w:r/>
+            <w:r>
+              <w:rPr>
+                <w:rFonts w:ascii="Arial" w:hAnsi="Arial"/>
+                <w:b w:val="0"/>
+                <w:sz w:val="12"/>
+              </w:rPr>
+              <w:t>Generate or scaffold NICE IEX hierarchy/profile export package from master roster data, including vendor, LOB, skills, queues, and configuration rules.</w:t>
+            </w:r>
+          </w:p>
+        </w:tc>
+        <w:tc>
+          <w:tcPr>
+            <w:tcW w:type="dxa" w:w="648"/>
+            <w:vAlign w:val="center"/>
+            <w:shd w:fill="FDF2E6"/>
+          </w:tcPr>
+          <w:p>
+            <w:pPr>
+              <w:jc w:val="left"/>
+            </w:pPr>
+            <w:r/>
+            <w:r>
+              <w:rPr>
+                <w:rFonts w:ascii="Arial" w:hAnsi="Arial"/>
+                <w:b w:val="0"/>
+                <w:sz w:val="14"/>
+              </w:rPr>
+              <w:t>3</w:t>
+            </w:r>
+          </w:p>
+        </w:tc>
+        <w:tc>
+          <w:tcPr>
+            <w:tcW w:type="dxa" w:w="4536"/>
+            <w:vAlign w:val="center"/>
+            <w:shd w:fill="FDF2E6"/>
+          </w:tcPr>
+          <w:p>
+            <w:pPr>
+              <w:jc w:val="left"/>
+            </w:pPr>
+            <w:r/>
+            <w:r>
+              <w:rPr>
+                <w:rFonts w:ascii="Arial" w:hAnsi="Arial"/>
+                <w:b w:val="0"/>
+                <w:sz w:val="12"/>
+              </w:rPr>
+              <w:t>NICE IEX package is generated or documented with exact blockers and required manual fields.</w:t>
+            </w:r>
+          </w:p>
+        </w:tc>
+      </w:tr>
+      <w:tr>
+        <w:tc>
+          <w:tcPr>
+            <w:tcW w:type="dxa" w:w="504"/>
+            <w:vAlign w:val="center"/>
+            <w:shd w:fill="FDF2E6"/>
+          </w:tcPr>
+          <w:p>
+            <w:pPr>
+              <w:jc w:val="left"/>
+            </w:pPr>
+            <w:r/>
+            <w:r>
+              <w:rPr>
+                <w:rFonts w:ascii="Arial" w:hAnsi="Arial"/>
+                <w:b w:val="0"/>
+                <w:sz w:val="14"/>
+              </w:rPr>
+              <w:t>16</w:t>
+            </w:r>
+          </w:p>
+        </w:tc>
+        <w:tc>
+          <w:tcPr>
+            <w:tcW w:type="dxa" w:w="1296"/>
+            <w:vAlign w:val="center"/>
+            <w:shd w:fill="FDF2E6"/>
+          </w:tcPr>
+          <w:p>
+            <w:pPr>
+              <w:jc w:val="left"/>
+            </w:pPr>
+            <w:r/>
+            <w:r>
+              <w:rPr>
+                <w:rFonts w:ascii="Arial" w:hAnsi="Arial"/>
+                <w:b w:val="0"/>
+                <w:sz w:val="14"/>
+              </w:rPr>
+              <w:t>Phase 8-9</w:t>
+            </w:r>
+          </w:p>
+        </w:tc>
+        <w:tc>
+          <w:tcPr>
+            <w:tcW w:type="dxa" w:w="2088"/>
+            <w:vAlign w:val="center"/>
+            <w:shd w:fill="FDF2E6"/>
+          </w:tcPr>
+          <w:p>
+            <w:pPr>
+              <w:jc w:val="left"/>
+            </w:pPr>
+            <w:r/>
+            <w:r>
+              <w:rPr>
+                <w:rFonts w:ascii="Arial" w:hAnsi="Arial"/>
+                <w:b w:val="0"/>
+                <w:sz w:val="14"/>
+              </w:rPr>
+              <w:t>Snapshot Publication, Recovery &amp; Governance</w:t>
+            </w:r>
+          </w:p>
+        </w:tc>
+        <w:tc>
+          <w:tcPr>
+            <w:tcW w:type="dxa" w:w="4536"/>
+            <w:vAlign w:val="center"/>
+            <w:shd w:fill="FDF2E6"/>
+          </w:tcPr>
+          <w:p>
+            <w:pPr>
+              <w:jc w:val="left"/>
+            </w:pPr>
+            <w:r/>
+            <w:r>
+              <w:rPr>
+                <w:rFonts w:ascii="Arial" w:hAnsi="Arial"/>
+                <w:b w:val="0"/>
+                <w:sz w:val="12"/>
+              </w:rPr>
+              <w:t>Implement versioned Access snapshot publication, checksum/manifest, archive rules, failed-batch recovery, and reconciliation report.</w:t>
+            </w:r>
+          </w:p>
+        </w:tc>
+        <w:tc>
+          <w:tcPr>
+            <w:tcW w:type="dxa" w:w="648"/>
+            <w:vAlign w:val="center"/>
+            <w:shd w:fill="FDF2E6"/>
+          </w:tcPr>
+          <w:p>
+            <w:pPr>
+              <w:jc w:val="left"/>
+            </w:pPr>
+            <w:r/>
+            <w:r>
+              <w:rPr>
+                <w:rFonts w:ascii="Arial" w:hAnsi="Arial"/>
+                <w:b w:val="0"/>
+                <w:sz w:val="14"/>
+              </w:rPr>
+              <w:t>3</w:t>
+            </w:r>
+          </w:p>
+        </w:tc>
+        <w:tc>
+          <w:tcPr>
+            <w:tcW w:type="dxa" w:w="4536"/>
+            <w:vAlign w:val="center"/>
+            <w:shd w:fill="FDF2E6"/>
+          </w:tcPr>
+          <w:p>
+            <w:pPr>
+              <w:jc w:val="left"/>
+            </w:pPr>
+            <w:r/>
+            <w:r>
+              <w:rPr>
+                <w:rFonts w:ascii="Arial" w:hAnsi="Arial"/>
+                <w:b w:val="0"/>
+                <w:sz w:val="12"/>
+              </w:rPr>
+              <w:t>Publish creates versioned snapshot and manifest; failed batches can be retried without duplicate application.</w:t>
+            </w:r>
+          </w:p>
+        </w:tc>
+      </w:tr>
+      <w:tr>
+        <w:tc>
+          <w:tcPr>
+            <w:tcW w:type="dxa" w:w="504"/>
+            <w:vAlign w:val="center"/>
+            <w:shd w:fill="FDF2E6"/>
+          </w:tcPr>
+          <w:p>
+            <w:pPr>
+              <w:jc w:val="left"/>
+            </w:pPr>
+            <w:r/>
+            <w:r>
+              <w:rPr>
+                <w:rFonts w:ascii="Arial" w:hAnsi="Arial"/>
+                <w:b w:val="0"/>
+                <w:sz w:val="14"/>
+              </w:rPr>
+              <w:t>17</w:t>
+            </w:r>
+          </w:p>
+        </w:tc>
+        <w:tc>
+          <w:tcPr>
+            <w:tcW w:type="dxa" w:w="1296"/>
+            <w:vAlign w:val="center"/>
+            <w:shd w:fill="FDF2E6"/>
+          </w:tcPr>
+          <w:p>
+            <w:pPr>
+              <w:jc w:val="left"/>
+            </w:pPr>
+            <w:r/>
+            <w:r>
+              <w:rPr>
+                <w:rFonts w:ascii="Arial" w:hAnsi="Arial"/>
+                <w:b w:val="0"/>
+                <w:sz w:val="14"/>
+              </w:rPr>
+              <w:t>All phases</w:t>
+            </w:r>
+          </w:p>
+        </w:tc>
+        <w:tc>
+          <w:tcPr>
+            <w:tcW w:type="dxa" w:w="2088"/>
+            <w:vAlign w:val="center"/>
+            <w:shd w:fill="FDF2E6"/>
+          </w:tcPr>
+          <w:p>
+            <w:pPr>
+              <w:jc w:val="left"/>
+            </w:pPr>
+            <w:r/>
+            <w:r>
+              <w:rPr>
+                <w:rFonts w:ascii="Arial" w:hAnsi="Arial"/>
+                <w:b w:val="0"/>
+                <w:sz w:val="14"/>
+              </w:rPr>
+              <w:t>Integration Tests</w:t>
+            </w:r>
+          </w:p>
+        </w:tc>
+        <w:tc>
+          <w:tcPr>
+            <w:tcW w:type="dxa" w:w="4536"/>
+            <w:vAlign w:val="center"/>
+            <w:shd w:fill="FDF2E6"/>
+          </w:tcPr>
+          <w:p>
+            <w:pPr>
+              <w:jc w:val="left"/>
+            </w:pPr>
+            <w:r/>
+            <w:r>
+              <w:rPr>
+                <w:rFonts w:ascii="Arial" w:hAnsi="Arial"/>
+                <w:b w:val="0"/>
+                <w:sz w:val="12"/>
+              </w:rPr>
+              <w:t>Test happy path from roster intake through validation, Fieldglass, master roster, IEX package/export, audit, and publication.</w:t>
+            </w:r>
+          </w:p>
+        </w:tc>
+        <w:tc>
+          <w:tcPr>
+            <w:tcW w:type="dxa" w:w="648"/>
+            <w:vAlign w:val="center"/>
+            <w:shd w:fill="FDF2E6"/>
+          </w:tcPr>
+          <w:p>
+            <w:pPr>
+              <w:jc w:val="left"/>
+            </w:pPr>
+            <w:r/>
+            <w:r>
+              <w:rPr>
+                <w:rFonts w:ascii="Arial" w:hAnsi="Arial"/>
+                <w:b w:val="0"/>
+                <w:sz w:val="14"/>
+              </w:rPr>
+              <w:t>4</w:t>
+            </w:r>
+          </w:p>
+        </w:tc>
+        <w:tc>
+          <w:tcPr>
+            <w:tcW w:type="dxa" w:w="4536"/>
+            <w:vAlign w:val="center"/>
+            <w:shd w:fill="FDF2E6"/>
+          </w:tcPr>
+          <w:p>
+            <w:pPr>
+              <w:jc w:val="left"/>
+            </w:pPr>
+            <w:r/>
+            <w:r>
+              <w:rPr>
+                <w:rFonts w:ascii="Arial" w:hAnsi="Arial"/>
+                <w:b w:val="0"/>
+                <w:sz w:val="12"/>
+              </w:rPr>
+              <w:t>End-to-end scenario passes with repeatable sample data.</w:t>
+            </w:r>
+          </w:p>
+        </w:tc>
+      </w:tr>
+      <w:tr>
+        <w:tc>
+          <w:tcPr>
+            <w:tcW w:type="dxa" w:w="504"/>
+            <w:vAlign w:val="center"/>
+            <w:shd w:fill="FDF2E6"/>
+          </w:tcPr>
+          <w:p>
+            <w:pPr>
+              <w:jc w:val="left"/>
+            </w:pPr>
+            <w:r/>
+            <w:r>
+              <w:rPr>
+                <w:rFonts w:ascii="Arial" w:hAnsi="Arial"/>
+                <w:b w:val="0"/>
+                <w:sz w:val="14"/>
+              </w:rPr>
+              <w:t>18</w:t>
+            </w:r>
+          </w:p>
+        </w:tc>
+        <w:tc>
+          <w:tcPr>
+            <w:tcW w:type="dxa" w:w="1296"/>
+            <w:vAlign w:val="center"/>
+            <w:shd w:fill="FDF2E6"/>
+          </w:tcPr>
+          <w:p>
+            <w:pPr>
+              <w:jc w:val="left"/>
+            </w:pPr>
+            <w:r/>
+            <w:r>
+              <w:rPr>
+                <w:rFonts w:ascii="Arial" w:hAnsi="Arial"/>
+                <w:b w:val="0"/>
+                <w:sz w:val="14"/>
+              </w:rPr>
+              <w:t>All phases</w:t>
+            </w:r>
+          </w:p>
+        </w:tc>
+        <w:tc>
+          <w:tcPr>
+            <w:tcW w:type="dxa" w:w="2088"/>
+            <w:vAlign w:val="center"/>
+            <w:shd w:fill="FDF2E6"/>
+          </w:tcPr>
+          <w:p>
+            <w:pPr>
+              <w:jc w:val="left"/>
+            </w:pPr>
+            <w:r/>
+            <w:r>
+              <w:rPr>
+                <w:rFonts w:ascii="Arial" w:hAnsi="Arial"/>
+                <w:b w:val="0"/>
+                <w:sz w:val="14"/>
+              </w:rPr>
+              <w:t>Failure &amp; Security Tests</w:t>
+            </w:r>
+          </w:p>
+        </w:tc>
+        <w:tc>
+          <w:tcPr>
+            <w:tcW w:type="dxa" w:w="4536"/>
+            <w:vAlign w:val="center"/>
+            <w:shd w:fill="FDF2E6"/>
+          </w:tcPr>
+          <w:p>
+            <w:pPr>
+              <w:jc w:val="left"/>
+            </w:pPr>
+            <w:r/>
+            <w:r>
+              <w:rPr>
+                <w:rFonts w:ascii="Arial" w:hAnsi="Arial"/>
+                <w:b w:val="0"/>
+                <w:sz w:val="12"/>
+              </w:rPr>
+              <w:t>Test bad Excel, missing headers, duplicate file/request, unauthorized user, stale version, failed export, checksum mismatch, and recovery.</w:t>
+            </w:r>
+          </w:p>
+        </w:tc>
+        <w:tc>
+          <w:tcPr>
+            <w:tcW w:type="dxa" w:w="648"/>
+            <w:vAlign w:val="center"/>
+            <w:shd w:fill="FDF2E6"/>
+          </w:tcPr>
+          <w:p>
+            <w:pPr>
+              <w:jc w:val="left"/>
+            </w:pPr>
+            <w:r/>
+            <w:r>
+              <w:rPr>
+                <w:rFonts w:ascii="Arial" w:hAnsi="Arial"/>
+                <w:b w:val="0"/>
+                <w:sz w:val="14"/>
+              </w:rPr>
+              <w:t>3</w:t>
+            </w:r>
+          </w:p>
+        </w:tc>
+        <w:tc>
+          <w:tcPr>
+            <w:tcW w:type="dxa" w:w="4536"/>
+            <w:vAlign w:val="center"/>
+            <w:shd w:fill="FDF2E6"/>
+          </w:tcPr>
+          <w:p>
+            <w:pPr>
+              <w:jc w:val="left"/>
+            </w:pPr>
+            <w:r/>
+            <w:r>
+              <w:rPr>
+                <w:rFonts w:ascii="Arial" w:hAnsi="Arial"/>
+                <w:b w:val="0"/>
+                <w:sz w:val="12"/>
+              </w:rPr>
+              <w:t>Failures route to expected status/folder and produce audit events with actionable error details.</w:t>
+            </w:r>
+          </w:p>
+        </w:tc>
+      </w:tr>
+      <w:tr>
+        <w:tc>
+          <w:tcPr>
+            <w:tcW w:type="dxa" w:w="504"/>
+            <w:vAlign w:val="center"/>
+            <w:shd w:fill="FDF2E6"/>
+          </w:tcPr>
+          <w:p>
+            <w:pPr>
+              <w:jc w:val="left"/>
+            </w:pPr>
+            <w:r/>
+            <w:r>
+              <w:rPr>
+                <w:rFonts w:ascii="Arial" w:hAnsi="Arial"/>
+                <w:b w:val="0"/>
+                <w:sz w:val="14"/>
+              </w:rPr>
+              <w:t>19</w:t>
+            </w:r>
+          </w:p>
+        </w:tc>
+        <w:tc>
+          <w:tcPr>
+            <w:tcW w:type="dxa" w:w="1296"/>
+            <w:vAlign w:val="center"/>
+            <w:shd w:fill="FDF2E6"/>
+          </w:tcPr>
+          <w:p>
+            <w:pPr>
+              <w:jc w:val="left"/>
+            </w:pPr>
+            <w:r/>
+            <w:r>
+              <w:rPr>
+                <w:rFonts w:ascii="Arial" w:hAnsi="Arial"/>
+                <w:b w:val="0"/>
+                <w:sz w:val="14"/>
+              </w:rPr>
+              <w:t>Phase 0-9</w:t>
+            </w:r>
+          </w:p>
+        </w:tc>
+        <w:tc>
+          <w:tcPr>
+            <w:tcW w:type="dxa" w:w="2088"/>
+            <w:vAlign w:val="center"/>
+            <w:shd w:fill="FDF2E6"/>
+          </w:tcPr>
+          <w:p>
+            <w:pPr>
+              <w:jc w:val="left"/>
+            </w:pPr>
+            <w:r/>
+            <w:r>
+              <w:rPr>
+                <w:rFonts w:ascii="Arial" w:hAnsi="Arial"/>
+                <w:b w:val="0"/>
+                <w:sz w:val="14"/>
+              </w:rPr>
+              <w:t>User Acceptance Testing</w:t>
+            </w:r>
+          </w:p>
+        </w:tc>
+        <w:tc>
+          <w:tcPr>
+            <w:tcW w:type="dxa" w:w="4536"/>
+            <w:vAlign w:val="center"/>
+            <w:shd w:fill="FDF2E6"/>
+          </w:tcPr>
+          <w:p>
+            <w:pPr>
+              <w:jc w:val="left"/>
+            </w:pPr>
+            <w:r/>
+            <w:r>
+              <w:rPr>
+                <w:rFonts w:ascii="Arial" w:hAnsi="Arial"/>
+                <w:b w:val="0"/>
+                <w:sz w:val="12"/>
+              </w:rPr>
+              <w:t>Run UAT with WFM/requester, vendor input, IAM/access management, KP approver, admin/writer, and auditor/monitor scenarios.</w:t>
+            </w:r>
+          </w:p>
+        </w:tc>
+        <w:tc>
+          <w:tcPr>
+            <w:tcW w:type="dxa" w:w="648"/>
+            <w:vAlign w:val="center"/>
+            <w:shd w:fill="FDF2E6"/>
+          </w:tcPr>
+          <w:p>
+            <w:pPr>
+              <w:jc w:val="left"/>
+            </w:pPr>
+            <w:r/>
+            <w:r>
+              <w:rPr>
+                <w:rFonts w:ascii="Arial" w:hAnsi="Arial"/>
+                <w:b w:val="0"/>
+                <w:sz w:val="14"/>
+              </w:rPr>
+              <w:t>4</w:t>
+            </w:r>
+          </w:p>
+        </w:tc>
+        <w:tc>
+          <w:tcPr>
+            <w:tcW w:type="dxa" w:w="4536"/>
+            <w:vAlign w:val="center"/>
+            <w:shd w:fill="FDF2E6"/>
+          </w:tcPr>
+          <w:p>
+            <w:pPr>
+              <w:jc w:val="left"/>
+            </w:pPr>
+            <w:r/>
+            <w:r>
+              <w:rPr>
+                <w:rFonts w:ascii="Arial" w:hAnsi="Arial"/>
+                <w:b w:val="0"/>
+                <w:sz w:val="12"/>
+              </w:rPr>
+              <w:t>UAT checklist is completed; defects and follow-up items are logged and prioritized.</w:t>
+            </w:r>
+          </w:p>
+        </w:tc>
+      </w:tr>
+      <w:tr>
+        <w:tc>
+          <w:tcPr>
+            <w:tcW w:type="dxa" w:w="504"/>
+            <w:vAlign w:val="center"/>
+            <w:shd w:fill="FDF2E6"/>
+          </w:tcPr>
+          <w:p>
+            <w:pPr>
+              <w:jc w:val="left"/>
+            </w:pPr>
+            <w:r/>
+            <w:r>
+              <w:rPr>
+                <w:rFonts w:ascii="Arial" w:hAnsi="Arial"/>
+                <w:b w:val="0"/>
+                <w:sz w:val="14"/>
+              </w:rPr>
+              <w:t>20</w:t>
+            </w:r>
+          </w:p>
+        </w:tc>
+        <w:tc>
+          <w:tcPr>
+            <w:tcW w:type="dxa" w:w="1296"/>
+            <w:vAlign w:val="center"/>
+            <w:shd w:fill="FDF2E6"/>
+          </w:tcPr>
+          <w:p>
+            <w:pPr>
+              <w:jc w:val="left"/>
+            </w:pPr>
+            <w:r/>
+            <w:r>
+              <w:rPr>
+                <w:rFonts w:ascii="Arial" w:hAnsi="Arial"/>
+                <w:b w:val="0"/>
+                <w:sz w:val="14"/>
+              </w:rPr>
+              <w:t>Phase 9</w:t>
+            </w:r>
+          </w:p>
+        </w:tc>
+        <w:tc>
+          <w:tcPr>
+            <w:tcW w:type="dxa" w:w="2088"/>
+            <w:vAlign w:val="center"/>
+            <w:shd w:fill="FDF2E6"/>
+          </w:tcPr>
+          <w:p>
+            <w:pPr>
+              <w:jc w:val="left"/>
+            </w:pPr>
+            <w:r/>
+            <w:r>
+              <w:rPr>
+                <w:rFonts w:ascii="Arial" w:hAnsi="Arial"/>
+                <w:b w:val="0"/>
+                <w:sz w:val="14"/>
+              </w:rPr>
+              <w:t>Documentation, Demo &amp; Handoff</w:t>
+            </w:r>
+          </w:p>
+        </w:tc>
+        <w:tc>
+          <w:tcPr>
+            <w:tcW w:type="dxa" w:w="4536"/>
+            <w:vAlign w:val="center"/>
+            <w:shd w:fill="FDF2E6"/>
+          </w:tcPr>
+          <w:p>
+            <w:pPr>
+              <w:jc w:val="left"/>
+            </w:pPr>
+            <w:r/>
+            <w:r>
+              <w:rPr>
+                <w:rFonts w:ascii="Arial" w:hAnsi="Arial"/>
+                <w:b w:val="0"/>
+                <w:sz w:val="12"/>
+              </w:rPr>
+              <w:t>Update user/admin/recovery docs, template mapping notes, test evidence, known risks, and final demo package.</w:t>
+            </w:r>
+          </w:p>
+        </w:tc>
+        <w:tc>
+          <w:tcPr>
+            <w:tcW w:type="dxa" w:w="648"/>
+            <w:vAlign w:val="center"/>
+            <w:shd w:fill="FDF2E6"/>
+          </w:tcPr>
+          <w:p>
+            <w:pPr>
+              <w:jc w:val="left"/>
+            </w:pPr>
+            <w:r/>
+            <w:r>
+              <w:rPr>
+                <w:rFonts w:ascii="Arial" w:hAnsi="Arial"/>
+                <w:b w:val="0"/>
+                <w:sz w:val="14"/>
+              </w:rPr>
+              <w:t>3</w:t>
+            </w:r>
+          </w:p>
+        </w:tc>
+        <w:tc>
+          <w:tcPr>
+            <w:tcW w:type="dxa" w:w="4536"/>
+            <w:vAlign w:val="center"/>
+            <w:shd w:fill="FDF2E6"/>
+          </w:tcPr>
+          <w:p>
+            <w:pPr>
+              <w:jc w:val="left"/>
+            </w:pPr>
+            <w:r/>
+            <w:r>
+              <w:rPr>
+                <w:rFonts w:ascii="Arial" w:hAnsi="Arial"/>
+                <w:b w:val="0"/>
+                <w:sz w:val="12"/>
+              </w:rPr>
+              <w:t>Handoff package is ready and Smartsheet/Kanban items can be closed or moved to next-phase backlog.</w:t>
+            </w:r>
+          </w:p>
+        </w:tc>
+      </w:tr>
+    </w:tbl>
+    <w:p>
+      <w:r>
+        <w:rPr>
+          <w:b/>
+        </w:rPr>
+        <w:t>Week 3 - Validation, UAT &amp; Handoff capacity:</w:t>
+      </w:r>
+      <w:r>
+        <w:t xml:space="preserve"> 20 hours.</w:t>
+      </w:r>
+    </w:p>
+    <w:p>
+      <w:pPr>
+        <w:pStyle w:val="Heading2"/>
+      </w:pPr>
+      <w:r>
+        <w:rPr>
+          <w:rFonts w:ascii="Arial" w:hAnsi="Arial"/>
+        </w:rPr>
+        <w:t>10.3 Weekly Milestones</w:t>
+      </w:r>
+    </w:p>
+    <w:p>
+      <w:r>
+        <w:rPr>
+          <w:b/>
+        </w:rPr>
+        <w:t>End of Week 1:</w:t>
+      </w:r>
+      <w:r>
+        <w:t xml:space="preserve"> Foundation complete: SharePoint paths, template inventory, Access/master roster model, Excel ingestion foundation, Fieldglass ingestion POC, and user/role validation.</w:t>
+      </w:r>
+    </w:p>
+    <w:p>
+      <w:r>
+        <w:rPr>
+          <w:b/>
+        </w:rPr>
+        <w:t>End of Week 2:</w:t>
+      </w:r>
+      <w:r>
+        <w:t xml:space="preserve"> Core workflow complete: request-driven CRUDs, admin import, idempotency, quarantine, approvals, application into Access working copy, master roster enrichment, bitacora, and Fieldglass output.</w:t>
+      </w:r>
+    </w:p>
+    <w:p>
+      <w:r>
+        <w:rPr>
+          <w:b/>
+        </w:rPr>
+        <w:t>End of Week 3:</w:t>
+      </w:r>
+      <w:r>
+        <w:t xml:space="preserve"> MVP validated: NICE IEX package/export, snapshot publication, recovery/reconciliation, integration tests, failure tests, UAT, documentation, and demo package.</w:t>
+      </w:r>
+    </w:p>
+    <w:p>
+      <w:pPr>
+        <w:pStyle w:val="Heading2"/>
+      </w:pPr>
+      <w:r>
+        <w:rPr>
+          <w:rFonts w:ascii="Arial" w:hAnsi="Arial"/>
+        </w:rPr>
+        <w:t>10.4 Definition of Done</w:t>
+      </w:r>
+    </w:p>
+    <w:p>
+      <w:pPr>
+        <w:pStyle w:val="ListBullet"/>
+      </w:pPr>
+      <w:r>
+        <w:t>Code runs on Python 3.10.</w:t>
+      </w:r>
+    </w:p>
+    <w:p>
+      <w:pPr>
+        <w:pStyle w:val="ListBullet"/>
+      </w:pPr>
+      <w:r>
+        <w:t>SharePoint/OneDrive paths are validated and reflected in runtime configuration.</w:t>
+      </w:r>
+    </w:p>
+    <w:p>
+      <w:pPr>
+        <w:pStyle w:val="ListBullet"/>
+      </w:pPr>
+      <w:r>
+        <w:t>Roster lock, Fieldglass, NICE IEX, and agent creation templates are inventoried and mapped.</w:t>
+      </w:r>
+    </w:p>
+    <w:p>
+      <w:pPr>
+        <w:pStyle w:val="ListBullet"/>
+      </w:pPr>
+      <w:r>
+        <w:t>Excel ingestion validates sheets, headers, mandatory fields, duplicate keys, and row-level errors.</w:t>
+      </w:r>
+    </w:p>
+    <w:p>
+      <w:pPr>
+        <w:pStyle w:val="ListBullet"/>
+      </w:pPr>
+      <w:r>
+        <w:t>CRUD operations are request-driven, approval-controlled, and audited.</w:t>
+      </w:r>
+    </w:p>
+    <w:p>
+      <w:pPr>
+        <w:pStyle w:val="ListBullet"/>
+      </w:pPr>
+      <w:r>
+        <w:t>Access remains the controlled master snapshot; clients do not write directly to the published database.</w:t>
+      </w:r>
+    </w:p>
+    <w:p>
+      <w:pPr>
+        <w:pStyle w:val="ListBullet"/>
+      </w:pPr>
+      <w:r>
+        <w:t>Fieldglass and NICE IEX outputs are generated or documented with exact manual blockers.</w:t>
+      </w:r>
+    </w:p>
+    <w:p>
+      <w:pPr>
+        <w:pStyle w:val="ListBullet"/>
+      </w:pPr>
+      <w:r>
+        <w:t>Audit/bitacora events exist for ingestion, validation, approvals, exports, publication, failures, and recovery.</w:t>
+      </w:r>
+    </w:p>
+    <w:p>
+      <w:pPr>
+        <w:pStyle w:val="ListBullet"/>
+      </w:pPr>
+      <w:r>
+        <w:t>Integration tests, failure tests, UAT notes, and handoff documentation are complete.</w:t>
+      </w:r>
+    </w:p>
+    <w:p>
+      <w:r>
+        <w:br w:type="page"/>
+      </w:r>
+    </w:p>
+    <w:p>
+      <w:pPr>
+        <w:pStyle w:val="Heading1"/>
+      </w:pPr>
+      <w:r>
+        <w:t>11. Smartsheet Kanban Import Package</w:t>
+      </w:r>
+    </w:p>
+    <w:p>
+      <w:r>
+        <w:rPr>
+          <w:b/>
+        </w:rPr>
+        <w:t xml:space="preserve">Purpose. </w:t>
+      </w:r>
+      <w:r>
+        <w:t>The work plan has been converted into a Smartsheet-ready hierarchy so the PM can import the project, move cards across the Kanban, and mark individual subtasks as they are completed.</w:t>
+      </w:r>
+    </w:p>
+    <w:p>
+      <w:r>
+        <w:rPr>
+          <w:b/>
+        </w:rPr>
+        <w:t xml:space="preserve">Import file. </w:t>
+      </w:r>
+      <w:r>
+        <w:t>Use docs/17_smartsheet_kanban_import.csv. The file contains 80 rows: 20 parent deliverables and 60 executable subtasks, totaling 60 hours across three weeks.</w:t>
+      </w:r>
+    </w:p>
+    <w:p>
+      <w:pPr>
+        <w:pStyle w:val="Heading2"/>
+      </w:pPr>
+      <w:r>
+        <w:t>Recommended Smartsheet setup</w:t>
+      </w:r>
+    </w:p>
+    <w:p>
+      <w:pPr>
+        <w:pStyle w:val="ListBullet"/>
+      </w:pPr>
+      <w:r>
+        <w:t>Import the CSV as the project sheet and keep Task ID, Parent ID, and Level as visible columns during setup.</w:t>
+      </w:r>
+    </w:p>
+    <w:p>
+      <w:pPr>
+        <w:pStyle w:val="ListBullet"/>
+      </w:pPr>
+      <w:r>
+        <w:t>Use Parent ID and Level to group each subtask below its deliverable. A deliverable is complete only when all child subtasks are Done.</w:t>
+      </w:r>
+    </w:p>
+    <w:p>
+      <w:pPr>
+        <w:pStyle w:val="ListBullet"/>
+      </w:pPr>
+      <w:r>
+        <w:t>Use Status as the Kanban status field with these values: Backlog, Ready, In Progress, Code Review / Validation, Testing, UAT, Done, and Blocked.</w:t>
+      </w:r>
+    </w:p>
+    <w:p>
+      <w:pPr>
+        <w:pStyle w:val="ListBullet"/>
+      </w:pPr>
+      <w:r>
+        <w:t>Add Smartsheet owners and dates during project kickoff; the imported Owner column provides the recommended role, not a named individual.</w:t>
+      </w:r>
+    </w:p>
+    <w:p>
+      <w:pPr>
+        <w:pStyle w:val="ListBullet"/>
+      </w:pPr>
+      <w:r>
+        <w:t>Use Dependency to connect the sequence. Multiple dependencies are separated with a semicolon.</w:t>
+      </w:r>
+    </w:p>
+    <w:p>
+      <w:pPr>
+        <w:pStyle w:val="Heading2"/>
+      </w:pPr>
+      <w:r>
+        <w:t>Imported field definitions</w:t>
+      </w:r>
+    </w:p>
+    <w:tbl>
+      <w:tblPr>
+        <w:tblStyle w:val="TableGrid"/>
+        <w:tblW w:type="auto" w:w="0"/>
+        <w:jc w:val="center"/>
+        <w:tblLook w:firstColumn="1" w:firstRow="1" w:lastColumn="0" w:lastRow="0" w:noHBand="0" w:noVBand="1" w:val="04A0"/>
+      </w:tblPr>
+      <w:tblGrid>
+        <w:gridCol w:w="4752"/>
+        <w:gridCol w:w="4752"/>
+        <w:gridCol w:w="4752"/>
+      </w:tblGrid>
+      <w:tr>
+        <w:tc>
+          <w:tcPr>
+            <w:tcW w:type="dxa" w:w="4752"/>
+            <w:vAlign w:val="center"/>
+            <w:shd w:fill="1F4E79"/>
+          </w:tcPr>
+          <w:p>
+            <w:r>
+              <w:rPr>
+                <w:b/>
+                <w:color w:val="FFFFFF"/>
+                <w:sz w:val="18"/>
+              </w:rPr>
+              <w:t>Field</w:t>
+            </w:r>
+          </w:p>
+        </w:tc>
+        <w:tc>
+          <w:tcPr>
+            <w:tcW w:type="dxa" w:w="4752"/>
+            <w:vAlign w:val="center"/>
+            <w:shd w:fill="1F4E79"/>
+          </w:tcPr>
+          <w:p>
+            <w:r>
+              <w:rPr>
+                <w:b/>
+                <w:color w:val="FFFFFF"/>
+                <w:sz w:val="18"/>
+              </w:rPr>
+              <w:t>Use in Smartsheet</w:t>
+            </w:r>
+          </w:p>
+        </w:tc>
+        <w:tc>
+          <w:tcPr>
+            <w:tcW w:type="dxa" w:w="4752"/>
+            <w:vAlign w:val="center"/>
+            <w:shd w:fill="1F4E79"/>
+          </w:tcPr>
+          <w:p>
+            <w:r>
+              <w:rPr>
+                <w:b/>
+                <w:color w:val="FFFFFF"/>
+                <w:sz w:val="18"/>
+              </w:rPr>
+              <w:t>Example</w:t>
+            </w:r>
+          </w:p>
+        </w:tc>
+      </w:tr>
+      <w:tr>
+        <w:tc>
+          <w:tcPr>
+            <w:tcW w:type="dxa" w:w="4752"/>
+            <w:vAlign w:val="center"/>
+          </w:tcPr>
+          <w:p>
+            <w:r>
+              <w:rPr>
+                <w:sz w:val="17"/>
+              </w:rPr>
+              <w:t>Task ID / Parent ID</w:t>
+            </w:r>
+          </w:p>
+        </w:tc>
+        <w:tc>
+          <w:tcPr>
+            <w:tcW w:type="dxa" w:w="4752"/>
+            <w:vAlign w:val="center"/>
+          </w:tcPr>
+          <w:p>
+            <w:r>
+              <w:rPr>
+                <w:sz w:val="17"/>
+              </w:rPr>
+              <w:t>Preserves parent-child hierarchy</w:t>
+            </w:r>
+          </w:p>
+        </w:tc>
+        <w:tc>
+          <w:tcPr>
+            <w:tcW w:type="dxa" w:w="4752"/>
+            <w:vAlign w:val="center"/>
+          </w:tcPr>
+          <w:p>
+            <w:r>
+              <w:rPr>
+                <w:sz w:val="17"/>
+              </w:rPr>
+              <w:t>D14 / D14.2</w:t>
+            </w:r>
+          </w:p>
+        </w:tc>
+      </w:tr>
+      <w:tr>
+        <w:tc>
+          <w:tcPr>
+            <w:tcW w:type="dxa" w:w="4752"/>
+            <w:vAlign w:val="center"/>
+          </w:tcPr>
+          <w:p>
+            <w:r>
+              <w:rPr>
+                <w:sz w:val="17"/>
+              </w:rPr>
+              <w:t>Level / Row Type</w:t>
+            </w:r>
+          </w:p>
+        </w:tc>
+        <w:tc>
+          <w:tcPr>
+            <w:tcW w:type="dxa" w:w="4752"/>
+            <w:vAlign w:val="center"/>
+          </w:tcPr>
+          <w:p>
+            <w:r>
+              <w:rPr>
+                <w:sz w:val="17"/>
+              </w:rPr>
+              <w:t>Identifies deliverables and subtasks</w:t>
+            </w:r>
+          </w:p>
+        </w:tc>
+        <w:tc>
+          <w:tcPr>
+            <w:tcW w:type="dxa" w:w="4752"/>
+            <w:vAlign w:val="center"/>
+          </w:tcPr>
+          <w:p>
+            <w:r>
+              <w:rPr>
+                <w:sz w:val="17"/>
+              </w:rPr>
+              <w:t>0 / Deliverable</w:t>
+            </w:r>
+          </w:p>
+        </w:tc>
+      </w:tr>
+      <w:tr>
+        <w:tc>
+          <w:tcPr>
+            <w:tcW w:type="dxa" w:w="4752"/>
+            <w:vAlign w:val="center"/>
+          </w:tcPr>
+          <w:p>
+            <w:r>
+              <w:rPr>
+                <w:sz w:val="17"/>
+              </w:rPr>
+              <w:t>Week / Phase</w:t>
+            </w:r>
+          </w:p>
+        </w:tc>
+        <w:tc>
+          <w:tcPr>
+            <w:tcW w:type="dxa" w:w="4752"/>
+            <w:vAlign w:val="center"/>
+          </w:tcPr>
+          <w:p>
+            <w:r>
+              <w:rPr>
+                <w:sz w:val="17"/>
+              </w:rPr>
+              <w:t>Supports weekly views and phase filters</w:t>
+            </w:r>
+          </w:p>
+        </w:tc>
+        <w:tc>
+          <w:tcPr>
+            <w:tcW w:type="dxa" w:w="4752"/>
+            <w:vAlign w:val="center"/>
+          </w:tcPr>
+          <w:p>
+            <w:r>
+              <w:rPr>
+                <w:sz w:val="17"/>
+              </w:rPr>
+              <w:t>2 / Phase 4-5</w:t>
+            </w:r>
+          </w:p>
+        </w:tc>
+      </w:tr>
+      <w:tr>
+        <w:tc>
+          <w:tcPr>
+            <w:tcW w:type="dxa" w:w="4752"/>
+            <w:vAlign w:val="center"/>
+          </w:tcPr>
+          <w:p>
+            <w:r>
+              <w:rPr>
+                <w:sz w:val="17"/>
+              </w:rPr>
+              <w:t>Task Name</w:t>
+            </w:r>
+          </w:p>
+        </w:tc>
+        <w:tc>
+          <w:tcPr>
+            <w:tcW w:type="dxa" w:w="4752"/>
+            <w:vAlign w:val="center"/>
+          </w:tcPr>
+          <w:p>
+            <w:r>
+              <w:rPr>
+                <w:sz w:val="17"/>
+              </w:rPr>
+              <w:t>Card or task title</w:t>
+            </w:r>
+          </w:p>
+        </w:tc>
+        <w:tc>
+          <w:tcPr>
+            <w:tcW w:type="dxa" w:w="4752"/>
+            <w:vAlign w:val="center"/>
+          </w:tcPr>
+          <w:p>
+            <w:r>
+              <w:rPr>
+                <w:sz w:val="17"/>
+              </w:rPr>
+              <w:t>Apply approved changes</w:t>
+            </w:r>
+          </w:p>
+        </w:tc>
+      </w:tr>
+      <w:tr>
+        <w:tc>
+          <w:tcPr>
+            <w:tcW w:type="dxa" w:w="4752"/>
+            <w:vAlign w:val="center"/>
+          </w:tcPr>
+          <w:p>
+            <w:r>
+              <w:rPr>
+                <w:sz w:val="17"/>
+              </w:rPr>
+              <w:t>Owner</w:t>
+            </w:r>
+          </w:p>
+        </w:tc>
+        <w:tc>
+          <w:tcPr>
+            <w:tcW w:type="dxa" w:w="4752"/>
+            <w:vAlign w:val="center"/>
+          </w:tcPr>
+          <w:p>
+            <w:r>
+              <w:rPr>
+                <w:sz w:val="17"/>
+              </w:rPr>
+              <w:t>Recommended role for assignment</w:t>
+            </w:r>
+          </w:p>
+        </w:tc>
+        <w:tc>
+          <w:tcPr>
+            <w:tcW w:type="dxa" w:w="4752"/>
+            <w:vAlign w:val="center"/>
+          </w:tcPr>
+          <w:p>
+            <w:r>
+              <w:rPr>
+                <w:sz w:val="17"/>
+              </w:rPr>
+              <w:t>Developer / Admin</w:t>
+            </w:r>
+          </w:p>
+        </w:tc>
+      </w:tr>
+      <w:tr>
+        <w:tc>
+          <w:tcPr>
+            <w:tcW w:type="dxa" w:w="4752"/>
+            <w:vAlign w:val="center"/>
+          </w:tcPr>
+          <w:p>
+            <w:r>
+              <w:rPr>
+                <w:sz w:val="17"/>
+              </w:rPr>
+              <w:t>Status</w:t>
+            </w:r>
+          </w:p>
+        </w:tc>
+        <w:tc>
+          <w:tcPr>
+            <w:tcW w:type="dxa" w:w="4752"/>
+            <w:vAlign w:val="center"/>
+          </w:tcPr>
+          <w:p>
+            <w:r>
+              <w:rPr>
+                <w:sz w:val="17"/>
+              </w:rPr>
+              <w:t>Kanban column/status value</w:t>
+            </w:r>
+          </w:p>
+        </w:tc>
+        <w:tc>
+          <w:tcPr>
+            <w:tcW w:type="dxa" w:w="4752"/>
+            <w:vAlign w:val="center"/>
+          </w:tcPr>
+          <w:p>
+            <w:r>
+              <w:rPr>
+                <w:sz w:val="17"/>
+              </w:rPr>
+              <w:t>Backlog</w:t>
+            </w:r>
+          </w:p>
+        </w:tc>
+      </w:tr>
+      <w:tr>
+        <w:tc>
+          <w:tcPr>
+            <w:tcW w:type="dxa" w:w="4752"/>
+            <w:vAlign w:val="center"/>
+          </w:tcPr>
+          <w:p>
+            <w:r>
+              <w:rPr>
+                <w:sz w:val="17"/>
+              </w:rPr>
+              <w:t>Estimate Hours</w:t>
+            </w:r>
+          </w:p>
+        </w:tc>
+        <w:tc>
+          <w:tcPr>
+            <w:tcW w:type="dxa" w:w="4752"/>
+            <w:vAlign w:val="center"/>
+          </w:tcPr>
+          <w:p>
+            <w:r>
+              <w:rPr>
+                <w:sz w:val="17"/>
+              </w:rPr>
+              <w:t>Planned effort and capacity tracking</w:t>
+            </w:r>
+          </w:p>
+        </w:tc>
+        <w:tc>
+          <w:tcPr>
+            <w:tcW w:type="dxa" w:w="4752"/>
+            <w:vAlign w:val="center"/>
+          </w:tcPr>
+          <w:p>
+            <w:r>
+              <w:rPr>
+                <w:sz w:val="17"/>
+              </w:rPr>
+              <w:t>1.5</w:t>
+            </w:r>
+          </w:p>
+        </w:tc>
+      </w:tr>
+      <w:tr>
+        <w:tc>
+          <w:tcPr>
+            <w:tcW w:type="dxa" w:w="4752"/>
+            <w:vAlign w:val="center"/>
+          </w:tcPr>
+          <w:p>
+            <w:r>
+              <w:rPr>
+                <w:sz w:val="17"/>
+              </w:rPr>
+              <w:t>Dependency</w:t>
+            </w:r>
+          </w:p>
+        </w:tc>
+        <w:tc>
+          <w:tcPr>
+            <w:tcW w:type="dxa" w:w="4752"/>
+            <w:vAlign w:val="center"/>
+          </w:tcPr>
+          <w:p>
+            <w:r>
+              <w:rPr>
+                <w:sz w:val="17"/>
+              </w:rPr>
+              <w:t>Predecessor task IDs</w:t>
+            </w:r>
+          </w:p>
+        </w:tc>
+        <w:tc>
+          <w:tcPr>
+            <w:tcW w:type="dxa" w:w="4752"/>
+            <w:vAlign w:val="center"/>
+          </w:tcPr>
+          <w:p>
+            <w:r>
+              <w:rPr>
+                <w:sz w:val="17"/>
+              </w:rPr>
+              <w:t>D10;D14</w:t>
+            </w:r>
+          </w:p>
+        </w:tc>
+      </w:tr>
+      <w:tr>
+        <w:tc>
+          <w:tcPr>
+            <w:tcW w:type="dxa" w:w="4752"/>
+            <w:vAlign w:val="center"/>
+          </w:tcPr>
+          <w:p>
+            <w:r>
+              <w:rPr>
+                <w:sz w:val="17"/>
+              </w:rPr>
+              <w:t>Acceptance Criteria</w:t>
+            </w:r>
+          </w:p>
+        </w:tc>
+        <w:tc>
+          <w:tcPr>
+            <w:tcW w:type="dxa" w:w="4752"/>
+            <w:vAlign w:val="center"/>
+          </w:tcPr>
+          <w:p>
+            <w:r>
+              <w:rPr>
+                <w:sz w:val="17"/>
+              </w:rPr>
+              <w:t>Definition of complete for the row</w:t>
+            </w:r>
+          </w:p>
+        </w:tc>
+        <w:tc>
+          <w:tcPr>
+            <w:tcW w:type="dxa" w:w="4752"/>
+            <w:vAlign w:val="center"/>
+          </w:tcPr>
+          <w:p>
+            <w:r>
+              <w:rPr>
+                <w:sz w:val="17"/>
+              </w:rPr>
+              <w:t>Output passes validation</w:t>
+            </w:r>
+          </w:p>
+        </w:tc>
+      </w:tr>
+      <w:tr>
+        <w:tc>
+          <w:tcPr>
+            <w:tcW w:type="dxa" w:w="4752"/>
+            <w:vAlign w:val="center"/>
+          </w:tcPr>
+          <w:p>
+            <w:r>
+              <w:rPr>
+                <w:sz w:val="17"/>
+              </w:rPr>
+              <w:t>Milestone / Notes</w:t>
+            </w:r>
+          </w:p>
+        </w:tc>
+        <w:tc>
+          <w:tcPr>
+            <w:tcW w:type="dxa" w:w="4752"/>
+            <w:vAlign w:val="center"/>
+          </w:tcPr>
+          <w:p>
+            <w:r>
+              <w:rPr>
+                <w:sz w:val="17"/>
+              </w:rPr>
+              <w:t>Weekly checkpoint or PM notes</w:t>
+            </w:r>
+          </w:p>
+        </w:tc>
+        <w:tc>
+          <w:tcPr>
+            <w:tcW w:type="dxa" w:w="4752"/>
+            <w:vAlign w:val="center"/>
+          </w:tcPr>
+          <w:p>
+            <w:r>
+              <w:rPr>
+                <w:sz w:val="17"/>
+              </w:rPr>
+              <w:t>Week 2 core workflow complete</w:t>
+            </w:r>
+          </w:p>
+        </w:tc>
+      </w:tr>
+    </w:tbl>
+    <w:p>
+      <w:pPr>
+        <w:pStyle w:val="Heading2"/>
+      </w:pPr>
+      <w:r>
+        <w:t>PM completion rule</w:t>
+      </w:r>
+    </w:p>
+    <w:p>
+      <w:r>
+        <w:rPr>
+          <w:b/>
+        </w:rPr>
+        <w:t xml:space="preserve">A deliverable may move to Done only when: </w:t>
+      </w:r>
+      <w:r>
+        <w:t>all subtasks are marked Done, the acceptance criteria are evidenced, required tests have passed, and any open risk or blocker has an explicit disposition. Items that cannot be completed within the 60-hour MVP remain in the next-phase backlog with an owner and next action.</w:t>
+      </w:r>
+    </w:p>
     <w:sectPr>
-      <w:pgSz w:w="12240" w:h="15840"/>
-      <w:pgMar w:top="720" w:right="864" w:bottom="720" w:left="864" w:header="720" w:footer="720" w:gutter="0"/>
+      <w:pgSz w:w="15840" w:h="12240" w:orient="landscape"/>
+      <w:pgMar w:top="792" w:right="792" w:bottom="792" w:left="792" w:header="720" w:footer="720" w:gutter="0"/>
       <w:cols w:space="720"/>
       <w:docGrid w:linePitch="360"/>
     </w:sectPr>
@@ -4622,8 +8734,8 @@
     <w:qFormat/>
     <w:rsid w:val="00FC693F"/>
     <w:rPr>
-      <w:rFonts w:ascii="Calibri" w:hAnsi="Calibri"/>
-      <w:sz w:val="21"/>
+      <w:rFonts w:ascii="Arial" w:hAnsi="Arial"/>
+      <w:sz w:val="18"/>
     </w:rPr>
   </w:style>
   <w:style w:type="paragraph" w:styleId="Heading1">
@@ -5057,6 +9169,10 @@
     <w:pPr>
       <w:spacing w:after="120"/>
     </w:pPr>
+    <w:rPr>
+      <w:rFonts w:ascii="Arial" w:hAnsi="Arial"/>
+      <w:sz w:val="18"/>
+    </w:rPr>
   </w:style>
   <w:style w:type="character" w:customStyle="1" w:styleId="BodyTextChar">
     <w:name w:val="Body Text Char"/>

</xml_diff>